<commit_message>
fyrsta persónu pov virkar
</commit_message>
<xml_diff>
--- a/annad/Skýrsla fyrir einstaklingsverkefni.docx
+++ b/annad/Skýrsla fyrir einstaklingsverkefni.docx
@@ -478,14 +478,134 @@
         </w:rPr>
         <w:t>lærði afar mikið af þessu verkefni og fram að lokaskilum mun ég betrumbæta það.</w:t>
       </w:r>
-      <w:r>
-        <w:rPr>
-          <w:sz w:val="24"/>
-          <w:szCs w:val="24"/>
-          <w:lang w:val="is-IS"/>
-        </w:rPr>
-        <w:t xml:space="preserve"> </w:t>
-      </w:r>
+    </w:p>
+    <w:p>
+      <w:pPr>
+        <w:rPr>
+          <w:sz w:val="24"/>
+          <w:szCs w:val="24"/>
+          <w:lang w:val="is-IS"/>
+        </w:rPr>
+      </w:pPr>
+    </w:p>
+    <w:p>
+      <w:pPr>
+        <w:rPr>
+          <w:sz w:val="24"/>
+          <w:szCs w:val="24"/>
+          <w:lang w:val="is-IS"/>
+        </w:rPr>
+      </w:pPr>
+      <w:r>
+        <w:rPr>
+          <w:sz w:val="24"/>
+          <w:szCs w:val="24"/>
+          <w:lang w:val="is-IS"/>
+        </w:rPr>
+        <w:t>Einkunnargjöf m.t.t. verkefnisins</w:t>
+      </w:r>
+    </w:p>
+    <w:p>
+      <w:pPr>
+        <w:rPr>
+          <w:sz w:val="24"/>
+          <w:szCs w:val="24"/>
+          <w:lang w:val="is-IS"/>
+        </w:rPr>
+      </w:pPr>
+      <w:r>
+        <w:rPr>
+          <w:sz w:val="24"/>
+          <w:szCs w:val="24"/>
+          <w:lang w:val="is-IS"/>
+        </w:rPr>
+        <w:t xml:space="preserve">Blender hönnun á safninu: </w:t>
+      </w:r>
+    </w:p>
+    <w:p>
+      <w:pPr>
+        <w:rPr>
+          <w:sz w:val="24"/>
+          <w:szCs w:val="24"/>
+          <w:lang w:val="is-IS"/>
+        </w:rPr>
+      </w:pPr>
+      <w:r>
+        <w:rPr>
+          <w:sz w:val="24"/>
+          <w:szCs w:val="24"/>
+          <w:lang w:val="is-IS"/>
+        </w:rPr>
+        <w:t xml:space="preserve">Árstíðarvirkni: </w:t>
+      </w:r>
+    </w:p>
+    <w:p>
+      <w:pPr>
+        <w:rPr>
+          <w:sz w:val="24"/>
+          <w:szCs w:val="24"/>
+          <w:lang w:val="is-IS"/>
+        </w:rPr>
+      </w:pPr>
+      <w:r>
+        <w:rPr>
+          <w:sz w:val="24"/>
+          <w:szCs w:val="24"/>
+          <w:lang w:val="is-IS"/>
+        </w:rPr>
+        <w:t xml:space="preserve">Smellt á styttu með upplýsingum um viðeigandi styttu: </w:t>
+      </w:r>
+    </w:p>
+    <w:p>
+      <w:pPr>
+        <w:rPr>
+          <w:sz w:val="24"/>
+          <w:szCs w:val="24"/>
+          <w:lang w:val="is-IS"/>
+        </w:rPr>
+      </w:pPr>
+      <w:r>
+        <w:rPr>
+          <w:sz w:val="24"/>
+          <w:szCs w:val="24"/>
+          <w:lang w:val="is-IS"/>
+        </w:rPr>
+        <w:t xml:space="preserve">Niðurhal á styttu: </w:t>
+      </w:r>
+    </w:p>
+    <w:p>
+      <w:pPr>
+        <w:rPr>
+          <w:sz w:val="24"/>
+          <w:szCs w:val="24"/>
+          <w:lang w:val="is-IS"/>
+        </w:rPr>
+      </w:pPr>
+      <w:r>
+        <w:rPr>
+          <w:sz w:val="24"/>
+          <w:szCs w:val="24"/>
+          <w:lang w:val="is-IS"/>
+        </w:rPr>
+        <w:t>CSS og útlit</w:t>
+      </w:r>
+      <w:r>
+        <w:rPr>
+          <w:sz w:val="24"/>
+          <w:szCs w:val="24"/>
+          <w:lang w:val="is-IS"/>
+        </w:rPr>
+        <w:t>.</w:t>
+      </w:r>
+    </w:p>
+    <w:p>
+      <w:pPr>
+        <w:rPr>
+          <w:sz w:val="24"/>
+          <w:szCs w:val="24"/>
+          <w:lang w:val="is-IS"/>
+        </w:rPr>
+      </w:pPr>
     </w:p>
     <w:p>
       <w:pPr>
@@ -648,7 +768,15 @@
           <w:szCs w:val="24"/>
           <w:lang w:val="is-IS"/>
         </w:rPr>
-        <w:t xml:space="preserve">þau voru góð fyrir three js forrit. </w:t>
+        <w:t>þau voru góð fyrir three js forrit</w:t>
+      </w:r>
+      <w:r>
+        <w:rPr>
+          <w:sz w:val="24"/>
+          <w:szCs w:val="24"/>
+          <w:lang w:val="is-IS"/>
+        </w:rPr>
+        <w:t>ið og gaf mér svigrúm fyrir að skapa eitthvað í verkefninu.</w:t>
       </w:r>
     </w:p>
     <w:p>
@@ -1281,24 +1409,65 @@
           <w:szCs w:val="24"/>
           <w:lang w:val="is-IS"/>
         </w:rPr>
-        <w:t>ground.</w:t>
-      </w:r>
-    </w:p>
-    <w:p>
-      <w:pPr>
-        <w:rPr>
-          <w:sz w:val="24"/>
-          <w:szCs w:val="24"/>
-          <w:lang w:val="is-IS"/>
-        </w:rPr>
-      </w:pPr>
-      <w:r>
-        <w:rPr>
-          <w:sz w:val="24"/>
-          <w:szCs w:val="24"/>
-          <w:lang w:val="is-IS"/>
-        </w:rPr>
-        <w:t xml:space="preserve">Svo setti ég upp seasonal effects fyrir umhverfið. </w:t>
+        <w:t>planið fyrir grasflötinn í garðinum</w:t>
+      </w:r>
+      <w:r>
+        <w:rPr>
+          <w:sz w:val="24"/>
+          <w:szCs w:val="24"/>
+          <w:lang w:val="is-IS"/>
+        </w:rPr>
+        <w:t>.</w:t>
+      </w:r>
+    </w:p>
+    <w:p>
+      <w:pPr>
+        <w:rPr>
+          <w:sz w:val="24"/>
+          <w:szCs w:val="24"/>
+          <w:lang w:val="is-IS"/>
+        </w:rPr>
+      </w:pPr>
+      <w:r>
+        <w:rPr>
+          <w:sz w:val="24"/>
+          <w:szCs w:val="24"/>
+          <w:lang w:val="is-IS"/>
+        </w:rPr>
+        <w:t xml:space="preserve">Ég setti árstíðarkviku </w:t>
+      </w:r>
+      <w:r>
+        <w:rPr>
+          <w:sz w:val="24"/>
+          <w:szCs w:val="24"/>
+          <w:lang w:val="is-IS"/>
+        </w:rPr>
+        <w:t>fyrir umhverfið</w:t>
+      </w:r>
+      <w:r>
+        <w:rPr>
+          <w:sz w:val="24"/>
+          <w:szCs w:val="24"/>
+          <w:lang w:val="is-IS"/>
+        </w:rPr>
+        <w:t xml:space="preserve"> og það var gert með því að ...</w:t>
+      </w:r>
+    </w:p>
+    <w:p>
+      <w:pPr>
+        <w:rPr>
+          <w:sz w:val="24"/>
+          <w:szCs w:val="24"/>
+          <w:lang w:val="is-IS"/>
+        </w:rPr>
+      </w:pPr>
+      <w:r>
+        <w:rPr>
+          <w:sz w:val="24"/>
+          <w:szCs w:val="24"/>
+          <w:lang w:val="is-IS"/>
+        </w:rPr>
+        <w:t xml:space="preserve"> </w:t>
       </w:r>
     </w:p>
     <w:p>

</xml_diff>

<commit_message>
staðsetning á vatnsberanum og jonsmessunott löguð
</commit_message>
<xml_diff>
--- a/annad/Skýrsla fyrir einstaklingsverkefni.docx
+++ b/annad/Skýrsla fyrir einstaklingsverkefni.docx
@@ -61,6 +61,43 @@
           <w:lang w:val="is-IS"/>
         </w:rPr>
       </w:pPr>
+      <w:r>
+        <w:rPr>
+          <w:sz w:val="24"/>
+          <w:szCs w:val="24"/>
+          <w:lang w:val="is-IS"/>
+        </w:rPr>
+        <w:t xml:space="preserve">Slóð á GitHub repo: </w:t>
+      </w:r>
+      <w:hyperlink r:id="rId7" w:history="1">
+        <w:r>
+          <w:rPr>
+            <w:rStyle w:val="Hyperlink"/>
+            <w:sz w:val="24"/>
+            <w:szCs w:val="24"/>
+            <w:lang w:val="is-IS"/>
+          </w:rPr>
+          <w:t>https://github.com/AsdisVal/einstaklings</w:t>
+        </w:r>
+      </w:hyperlink>
+    </w:p>
+    <w:p>
+      <w:pPr>
+        <w:rPr>
+          <w:sz w:val="24"/>
+          <w:szCs w:val="24"/>
+          <w:lang w:val="is-IS"/>
+        </w:rPr>
+      </w:pPr>
+    </w:p>
+    <w:p>
+      <w:pPr>
+        <w:rPr>
+          <w:sz w:val="24"/>
+          <w:szCs w:val="24"/>
+          <w:lang w:val="is-IS"/>
+        </w:rPr>
+      </w:pPr>
     </w:p>
     <w:p>
       <w:pPr>
@@ -275,7 +312,7 @@
         </w:rPr>
         <w:t xml:space="preserve">HÍ netfang: </w:t>
       </w:r>
-      <w:hyperlink r:id="rId7" w:history="1">
+      <w:hyperlink r:id="rId8" w:history="1">
         <w:r>
           <w:rPr>
             <w:rStyle w:val="Hyperlink"/>
@@ -911,7 +948,7 @@
                     <pic:cNvPicPr/>
                   </pic:nvPicPr>
                   <pic:blipFill>
-                    <a:blip r:embed="rId8"/>
+                    <a:blip r:embed="rId9"/>
                     <a:stretch>
                       <a:fillRect/>
                     </a:stretch>
@@ -981,7 +1018,7 @@
                     <pic:cNvPicPr/>
                   </pic:nvPicPr>
                   <pic:blipFill>
-                    <a:blip r:embed="rId9"/>
+                    <a:blip r:embed="rId10"/>
                     <a:stretch>
                       <a:fillRect/>
                     </a:stretch>
@@ -1044,7 +1081,7 @@
                     <pic:cNvPicPr/>
                   </pic:nvPicPr>
                   <pic:blipFill>
-                    <a:blip r:embed="rId10"/>
+                    <a:blip r:embed="rId11"/>
                     <a:stretch>
                       <a:fillRect/>
                     </a:stretch>
@@ -1106,7 +1143,7 @@
                     <pic:cNvPicPr/>
                   </pic:nvPicPr>
                   <pic:blipFill>
-                    <a:blip r:embed="rId11"/>
+                    <a:blip r:embed="rId12"/>
                     <a:stretch>
                       <a:fillRect/>
                     </a:stretch>
@@ -1168,7 +1205,7 @@
                     <pic:cNvPicPr/>
                   </pic:nvPicPr>
                   <pic:blipFill>
-                    <a:blip r:embed="rId12"/>
+                    <a:blip r:embed="rId13"/>
                     <a:stretch>
                       <a:fillRect/>
                     </a:stretch>
@@ -1231,7 +1268,7 @@
                     <pic:cNvPicPr/>
                   </pic:nvPicPr>
                   <pic:blipFill>
-                    <a:blip r:embed="rId13"/>
+                    <a:blip r:embed="rId14"/>
                     <a:stretch>
                       <a:fillRect/>
                     </a:stretch>
@@ -1293,7 +1330,7 @@
                     <pic:cNvPicPr/>
                   </pic:nvPicPr>
                   <pic:blipFill>
-                    <a:blip r:embed="rId14"/>
+                    <a:blip r:embed="rId15"/>
                     <a:stretch>
                       <a:fillRect/>
                     </a:stretch>
@@ -1356,7 +1393,7 @@
                     <pic:cNvPicPr/>
                   </pic:nvPicPr>
                   <pic:blipFill>
-                    <a:blip r:embed="rId15"/>
+                    <a:blip r:embed="rId16"/>
                     <a:stretch>
                       <a:fillRect/>
                     </a:stretch>
@@ -1992,12 +2029,12 @@
       </w:pPr>
     </w:p>
     <w:sectPr>
-      <w:headerReference w:type="even" r:id="rId16"/>
-      <w:headerReference w:type="default" r:id="rId17"/>
-      <w:footerReference w:type="even" r:id="rId18"/>
-      <w:footerReference w:type="default" r:id="rId19"/>
-      <w:headerReference w:type="first" r:id="rId20"/>
-      <w:footerReference w:type="first" r:id="rId21"/>
+      <w:headerReference w:type="even" r:id="rId17"/>
+      <w:headerReference w:type="default" r:id="rId18"/>
+      <w:footerReference w:type="even" r:id="rId19"/>
+      <w:footerReference w:type="default" r:id="rId20"/>
+      <w:headerReference w:type="first" r:id="rId21"/>
+      <w:footerReference w:type="first" r:id="rId22"/>
       <w:pgSz w:w="11906" w:h="16838"/>
       <w:pgMar w:top="1440" w:right="1440" w:bottom="1440" w:left="1440" w:header="708" w:footer="708" w:gutter="0"/>
       <w:cols w:space="708"/>

</xml_diff>

<commit_message>
betri og einfaldari útgáfa af index og styles
</commit_message>
<xml_diff>
--- a/annad/Skýrsla fyrir einstaklingsverkefni.docx
+++ b/annad/Skýrsla fyrir einstaklingsverkefni.docx
@@ -114,8 +114,18 @@
           <w:szCs w:val="32"/>
           <w:lang w:val="is-IS"/>
         </w:rPr>
-        <w:t>Einstaklingsverkefni í Vefforritun 2</w:t>
-      </w:r>
+        <w:t>Garður Ásmundar í þrívídd</w:t>
+      </w:r>
+    </w:p>
+    <w:p>
+      <w:pPr>
+        <w:jc w:val="center"/>
+        <w:rPr>
+          <w:sz w:val="32"/>
+          <w:szCs w:val="32"/>
+          <w:lang w:val="is-IS"/>
+        </w:rPr>
+      </w:pPr>
     </w:p>
     <w:p>
       <w:pPr>
@@ -389,6 +399,7 @@
           <w:szCs w:val="28"/>
           <w:lang w:val="is-IS"/>
         </w:rPr>
+        <w:lastRenderedPageBreak/>
         <w:br w:type="page"/>
       </w:r>
     </w:p>
@@ -424,31 +435,87 @@
           <w:szCs w:val="24"/>
           <w:lang w:val="is-IS"/>
         </w:rPr>
-        <w:t>Hugmynd að verkefninu kom þegar ég var í áfanga í tölvugrafík</w:t>
-      </w:r>
-      <w:r>
-        <w:rPr>
-          <w:sz w:val="24"/>
-          <w:szCs w:val="24"/>
-          <w:lang w:val="is-IS"/>
-        </w:rPr>
-        <w:t xml:space="preserve"> á haustönn 2024</w:t>
-      </w:r>
-      <w:r>
-        <w:rPr>
-          <w:sz w:val="24"/>
-          <w:szCs w:val="24"/>
-          <w:lang w:val="is-IS"/>
-        </w:rPr>
-        <w:t xml:space="preserve">, og þar </w:t>
-      </w:r>
-      <w:r>
-        <w:rPr>
-          <w:sz w:val="24"/>
-          <w:szCs w:val="24"/>
-          <w:lang w:val="is-IS"/>
-        </w:rPr>
-        <w:t xml:space="preserve"> sem ég bý beint á móti Ásmundarsafni fannst mér það skemmtilegt </w:t>
+        <w:t>Hugmynd</w:t>
+      </w:r>
+      <w:r>
+        <w:rPr>
+          <w:sz w:val="24"/>
+          <w:szCs w:val="24"/>
+          <w:lang w:val="is-IS"/>
+        </w:rPr>
+        <w:t>in</w:t>
+      </w:r>
+      <w:r>
+        <w:rPr>
+          <w:sz w:val="24"/>
+          <w:szCs w:val="24"/>
+          <w:lang w:val="is-IS"/>
+        </w:rPr>
+        <w:t xml:space="preserve"> að verkefninu kom þegar ég var í tölvugrafík</w:t>
+      </w:r>
+      <w:r>
+        <w:rPr>
+          <w:sz w:val="24"/>
+          <w:szCs w:val="24"/>
+          <w:lang w:val="is-IS"/>
+        </w:rPr>
+        <w:t xml:space="preserve"> á </w:t>
+      </w:r>
+      <w:r>
+        <w:rPr>
+          <w:sz w:val="24"/>
+          <w:szCs w:val="24"/>
+          <w:lang w:val="is-IS"/>
+        </w:rPr>
+        <w:t xml:space="preserve">seinustu </w:t>
+      </w:r>
+      <w:r>
+        <w:rPr>
+          <w:sz w:val="24"/>
+          <w:szCs w:val="24"/>
+          <w:lang w:val="is-IS"/>
+        </w:rPr>
+        <w:t>haustönn</w:t>
+      </w:r>
+      <w:r>
+        <w:rPr>
+          <w:sz w:val="24"/>
+          <w:szCs w:val="24"/>
+          <w:lang w:val="is-IS"/>
+        </w:rPr>
+        <w:t>.</w:t>
+      </w:r>
+      <w:r>
+        <w:rPr>
+          <w:sz w:val="24"/>
+          <w:szCs w:val="24"/>
+          <w:lang w:val="is-IS"/>
+        </w:rPr>
+        <w:t xml:space="preserve"> </w:t>
+      </w:r>
+      <w:r>
+        <w:rPr>
+          <w:sz w:val="24"/>
+          <w:szCs w:val="24"/>
+          <w:lang w:val="is-IS"/>
+        </w:rPr>
+        <w:t>Ásmundarsafni</w:t>
+      </w:r>
+      <w:r>
+        <w:rPr>
+          <w:sz w:val="24"/>
+          <w:szCs w:val="24"/>
+          <w:lang w:val="is-IS"/>
+        </w:rPr>
+        <w:t>ð</w:t>
+      </w:r>
+      <w:r>
+        <w:rPr>
+          <w:sz w:val="24"/>
+          <w:szCs w:val="24"/>
+          <w:lang w:val="is-IS"/>
+        </w:rPr>
+        <w:t xml:space="preserve"> fannst mér það skemmtilegt </w:t>
       </w:r>
       <w:r>
         <w:rPr>
@@ -489,31 +556,6 @@
           <w:lang w:val="is-IS"/>
         </w:rPr>
         <w:t xml:space="preserve"> Verkefnið er þrívíddar útgáfa af Ásmundarsafni og þegar smellt er á styttu koma uplýsingar um hana.</w:t>
-      </w:r>
-    </w:p>
-    <w:p>
-      <w:pPr>
-        <w:rPr>
-          <w:sz w:val="24"/>
-          <w:szCs w:val="24"/>
-          <w:lang w:val="is-IS"/>
-        </w:rPr>
-      </w:pPr>
-      <w:r>
-        <w:rPr>
-          <w:sz w:val="24"/>
-          <w:szCs w:val="24"/>
-          <w:lang w:val="is-IS"/>
-        </w:rPr>
-        <w:t xml:space="preserve">Ég </w:t>
-      </w:r>
-      <w:r>
-        <w:rPr>
-          <w:sz w:val="24"/>
-          <w:szCs w:val="24"/>
-          <w:lang w:val="is-IS"/>
-        </w:rPr>
-        <w:t>lærði afar mikið af þessu verkefni og fram að lokaskilum mun ég betrumbæta það.</w:t>
       </w:r>
     </w:p>
     <w:p>
@@ -706,7 +748,23 @@
           <w:szCs w:val="24"/>
           <w:lang w:val="is-IS"/>
         </w:rPr>
-        <w:t xml:space="preserve">Framendi: Three.js og CSS. Three.js mun sjá um þriggja víddar framsetningu og CSS mun nýtast fyrir stíl og framsetningu. </w:t>
+        <w:t xml:space="preserve">Framendi: Three.js og CSS. Three.js mun sjá um þriggja víddar framsetningu og CSS mun </w:t>
+      </w:r>
+      <w:r>
+        <w:rPr>
+          <w:sz w:val="24"/>
+          <w:szCs w:val="24"/>
+          <w:lang w:val="is-IS"/>
+        </w:rPr>
+        <w:t xml:space="preserve">sjá um útlitið þegar kemur að textalýsingu, hreyfimynum, og þess háttar </w:t>
+      </w:r>
+      <w:r>
+        <w:rPr>
+          <w:sz w:val="24"/>
+          <w:szCs w:val="24"/>
+          <w:lang w:val="is-IS"/>
+        </w:rPr>
+        <w:t xml:space="preserve">framsetningu. </w:t>
       </w:r>
     </w:p>
     <w:p>
@@ -728,7 +786,123 @@
           <w:szCs w:val="24"/>
           <w:lang w:val="is-IS"/>
         </w:rPr>
-        <w:t xml:space="preserve">Flóknari framendi: Notkun á Three.js fyrir þriggja víddar umhverfi og CSS fyrir flóknari stíl og kvikun. </w:t>
+        <w:t>Flóknari framendi</w:t>
+      </w:r>
+      <w:r>
+        <w:rPr>
+          <w:sz w:val="24"/>
+          <w:szCs w:val="24"/>
+          <w:lang w:val="is-IS"/>
+        </w:rPr>
+        <w:t xml:space="preserve"> útfærður</w:t>
+      </w:r>
+    </w:p>
+    <w:p>
+      <w:pPr>
+        <w:pStyle w:val="ListParagraph"/>
+        <w:numPr>
+          <w:ilvl w:val="1"/>
+          <w:numId w:val="1"/>
+        </w:numPr>
+        <w:rPr>
+          <w:sz w:val="24"/>
+          <w:szCs w:val="24"/>
+          <w:lang w:val="is-IS"/>
+        </w:rPr>
+      </w:pPr>
+      <w:r>
+        <w:rPr>
+          <w:sz w:val="24"/>
+          <w:szCs w:val="24"/>
+          <w:lang w:val="is-IS"/>
+        </w:rPr>
+        <w:t xml:space="preserve">Three.js </w:t>
+      </w:r>
+      <w:r>
+        <w:rPr>
+          <w:sz w:val="24"/>
+          <w:szCs w:val="24"/>
+          <w:lang w:val="is-IS"/>
+        </w:rPr>
+        <w:t>sér um</w:t>
+      </w:r>
+      <w:r>
+        <w:rPr>
+          <w:sz w:val="24"/>
+          <w:szCs w:val="24"/>
+          <w:lang w:val="is-IS"/>
+        </w:rPr>
+        <w:t xml:space="preserve"> þriggja víddar umhverfi</w:t>
+      </w:r>
+      <w:r>
+        <w:rPr>
+          <w:sz w:val="24"/>
+          <w:szCs w:val="24"/>
+          <w:lang w:val="is-IS"/>
+        </w:rPr>
+        <w:t>ð og virknina sem varðar umhverfið</w:t>
+      </w:r>
+    </w:p>
+    <w:p>
+      <w:pPr>
+        <w:pStyle w:val="ListParagraph"/>
+        <w:numPr>
+          <w:ilvl w:val="1"/>
+          <w:numId w:val="1"/>
+        </w:numPr>
+        <w:rPr>
+          <w:sz w:val="24"/>
+          <w:szCs w:val="24"/>
+          <w:lang w:val="is-IS"/>
+        </w:rPr>
+      </w:pPr>
+      <w:r>
+        <w:rPr>
+          <w:sz w:val="24"/>
+          <w:szCs w:val="24"/>
+          <w:lang w:val="is-IS"/>
+        </w:rPr>
+        <w:t xml:space="preserve">CSS </w:t>
+      </w:r>
+      <w:r>
+        <w:rPr>
+          <w:sz w:val="24"/>
+          <w:szCs w:val="24"/>
+          <w:lang w:val="is-IS"/>
+        </w:rPr>
+        <w:t xml:space="preserve">sér um </w:t>
+      </w:r>
+      <w:r>
+        <w:rPr>
+          <w:sz w:val="24"/>
+          <w:szCs w:val="24"/>
+          <w:lang w:val="is-IS"/>
+        </w:rPr>
+        <w:t xml:space="preserve">útlit á texta, animation og um </w:t>
+      </w:r>
+      <w:r>
+        <w:rPr>
+          <w:sz w:val="24"/>
+          <w:szCs w:val="24"/>
+          <w:lang w:val="is-IS"/>
+        </w:rPr>
+        <w:t>kvikun</w:t>
+      </w:r>
+      <w:r>
+        <w:rPr>
+          <w:sz w:val="24"/>
+          <w:szCs w:val="24"/>
+          <w:lang w:val="is-IS"/>
+        </w:rPr>
+        <w:t>ina í verkefninu</w:t>
+      </w:r>
+      <w:r>
+        <w:rPr>
+          <w:sz w:val="24"/>
+          <w:szCs w:val="24"/>
+          <w:lang w:val="is-IS"/>
+        </w:rPr>
+        <w:t xml:space="preserve"> </w:t>
       </w:r>
     </w:p>
     <w:p>
@@ -750,7 +924,39 @@
           <w:szCs w:val="24"/>
           <w:lang w:val="is-IS"/>
         </w:rPr>
-        <w:t xml:space="preserve">Greining og verkplan: Greining verkefnisins, niðurbrot á verkþáttum og tímalína verða unnin og kynnt í skýrslu. </w:t>
+        <w:t>Greining og verkplan:Greining verkefnisins, niðurbrot á verkþáttum og tímalína v</w:t>
+      </w:r>
+      <w:r>
+        <w:rPr>
+          <w:sz w:val="24"/>
+          <w:szCs w:val="24"/>
+          <w:lang w:val="is-IS"/>
+        </w:rPr>
+        <w:t>ar</w:t>
+      </w:r>
+      <w:r>
+        <w:rPr>
+          <w:sz w:val="24"/>
+          <w:szCs w:val="24"/>
+          <w:lang w:val="is-IS"/>
+        </w:rPr>
+        <w:t xml:space="preserve"> unnin og </w:t>
+      </w:r>
+      <w:r>
+        <w:rPr>
+          <w:sz w:val="24"/>
+          <w:szCs w:val="24"/>
+          <w:lang w:val="is-IS"/>
+        </w:rPr>
+        <w:t xml:space="preserve">verður </w:t>
+      </w:r>
+      <w:r>
+        <w:rPr>
+          <w:sz w:val="24"/>
+          <w:szCs w:val="24"/>
+          <w:lang w:val="is-IS"/>
+        </w:rPr>
+        <w:t xml:space="preserve">kynnt í skýrslu. </w:t>
       </w:r>
     </w:p>
     <w:p>
@@ -772,7 +978,45 @@
           <w:szCs w:val="24"/>
           <w:lang w:val="is-IS"/>
         </w:rPr>
-        <w:t>Annað umhverfi en Node.js: Verkefnið mun nýtast við Three.js og ekki Node</w:t>
+        <w:t xml:space="preserve">Annað umhverfi en Node.js: </w:t>
+      </w:r>
+    </w:p>
+    <w:p>
+      <w:pPr>
+        <w:pStyle w:val="ListParagraph"/>
+        <w:numPr>
+          <w:ilvl w:val="1"/>
+          <w:numId w:val="1"/>
+        </w:numPr>
+        <w:rPr>
+          <w:sz w:val="24"/>
+          <w:szCs w:val="24"/>
+          <w:lang w:val="is-IS"/>
+        </w:rPr>
+      </w:pPr>
+      <w:r>
+        <w:rPr>
+          <w:sz w:val="24"/>
+          <w:szCs w:val="24"/>
+          <w:lang w:val="is-IS"/>
+        </w:rPr>
+        <w:t xml:space="preserve">Verkefnið mun </w:t>
+      </w:r>
+      <w:r>
+        <w:rPr>
+          <w:sz w:val="24"/>
+          <w:szCs w:val="24"/>
+          <w:lang w:val="is-IS"/>
+        </w:rPr>
+        <w:t>notaði</w:t>
+      </w:r>
+      <w:r>
+        <w:rPr>
+          <w:sz w:val="24"/>
+          <w:szCs w:val="24"/>
+          <w:lang w:val="is-IS"/>
+        </w:rPr>
+        <w:t xml:space="preserve"> Three.js</w:t>
       </w:r>
     </w:p>
     <w:p>
@@ -856,6 +1100,23 @@
           <w:szCs w:val="24"/>
           <w:lang w:val="is-IS"/>
         </w:rPr>
+        <w:t xml:space="preserve">Ég byrjaði í verkefninu í viku sex og kláraði það í viku þrettán(15. Apríl). </w:t>
+      </w:r>
+    </w:p>
+    <w:p>
+      <w:pPr>
+        <w:rPr>
+          <w:sz w:val="24"/>
+          <w:szCs w:val="24"/>
+          <w:lang w:val="is-IS"/>
+        </w:rPr>
+      </w:pPr>
+      <w:r>
+        <w:rPr>
+          <w:sz w:val="24"/>
+          <w:szCs w:val="24"/>
+          <w:lang w:val="is-IS"/>
+        </w:rPr>
         <w:t xml:space="preserve">Ég hélt mér nokkuð vel við verkplanið en þar sem ég bætti við </w:t>
       </w:r>
       <w:r>
@@ -897,6 +1158,7 @@
           <w:szCs w:val="24"/>
           <w:lang w:val="is-IS"/>
         </w:rPr>
+        <w:lastRenderedPageBreak/>
         <w:t>Hér er verkáætlunin mín</w:t>
       </w:r>
       <w:r>
@@ -931,7 +1193,6 @@
           <w:szCs w:val="24"/>
           <w:lang w:val="is-IS"/>
         </w:rPr>
-        <w:lastRenderedPageBreak/>
         <w:drawing>
           <wp:inline distT="0" distB="0" distL="0" distR="0" wp14:anchorId="64557349" wp14:editId="1F2F88F3">
             <wp:extent cx="5334274" cy="2762392"/>
@@ -2015,15 +2276,6 @@
     <w:p>
       <w:pPr>
         <w:rPr>
-          <w:sz w:val="24"/>
-          <w:szCs w:val="24"/>
-          <w:lang w:val="is-IS"/>
-        </w:rPr>
-      </w:pPr>
-    </w:p>
-    <w:p>
-      <w:pPr>
-        <w:rPr>
           <w:lang w:val="is-IS"/>
         </w:rPr>
       </w:pPr>
@@ -2171,7 +2423,7 @@
         <w:rFonts w:ascii="Symbol" w:eastAsiaTheme="minorHAnsi" w:hAnsi="Symbol" w:cstheme="minorBidi" w:hint="default"/>
       </w:rPr>
     </w:lvl>
-    <w:lvl w:ilvl="1" w:tplc="08090003" w:tentative="1">
+    <w:lvl w:ilvl="1" w:tplc="08090003">
       <w:start w:val="1"/>
       <w:numFmt w:val="bullet"/>
       <w:lvlText w:val="o"/>
@@ -2877,7 +3129,6 @@
   <w:style w:type="character" w:default="1" w:styleId="DefaultParagraphFont">
     <w:name w:val="Default Paragraph Font"/>
     <w:uiPriority w:val="1"/>
-    <w:semiHidden/>
     <w:unhideWhenUsed/>
   </w:style>
   <w:style w:type="table" w:default="1" w:styleId="TableNormal">

</xml_diff>

<commit_message>
geri read me til oryggis
</commit_message>
<xml_diff>
--- a/annad/Skýrsla fyrir einstaklingsverkefni.docx
+++ b/annad/Skýrsla fyrir einstaklingsverkefni.docx
@@ -129,75 +129,55 @@
     </w:p>
     <w:p>
       <w:pPr>
-        <w:rPr>
-          <w:sz w:val="24"/>
-          <w:szCs w:val="24"/>
-          <w:lang w:val="is-IS"/>
-        </w:rPr>
-      </w:pPr>
-    </w:p>
-    <w:p>
-      <w:pPr>
-        <w:rPr>
-          <w:sz w:val="24"/>
-          <w:szCs w:val="24"/>
-          <w:lang w:val="is-IS"/>
-        </w:rPr>
-      </w:pPr>
-    </w:p>
-    <w:p>
-      <w:pPr>
-        <w:rPr>
-          <w:sz w:val="24"/>
-          <w:szCs w:val="24"/>
-          <w:lang w:val="is-IS"/>
-        </w:rPr>
-      </w:pPr>
-    </w:p>
-    <w:p>
-      <w:pPr>
-        <w:rPr>
-          <w:sz w:val="24"/>
-          <w:szCs w:val="24"/>
-          <w:lang w:val="is-IS"/>
-        </w:rPr>
-      </w:pPr>
-    </w:p>
-    <w:p>
-      <w:pPr>
-        <w:rPr>
-          <w:sz w:val="24"/>
-          <w:szCs w:val="24"/>
-          <w:lang w:val="is-IS"/>
-        </w:rPr>
-      </w:pPr>
-    </w:p>
-    <w:p>
-      <w:pPr>
-        <w:rPr>
-          <w:sz w:val="24"/>
-          <w:szCs w:val="24"/>
-          <w:lang w:val="is-IS"/>
-        </w:rPr>
-      </w:pPr>
-    </w:p>
-    <w:p>
-      <w:pPr>
-        <w:rPr>
-          <w:sz w:val="24"/>
-          <w:szCs w:val="24"/>
-          <w:lang w:val="is-IS"/>
-        </w:rPr>
-      </w:pPr>
-    </w:p>
-    <w:p>
-      <w:pPr>
-        <w:rPr>
-          <w:sz w:val="24"/>
-          <w:szCs w:val="24"/>
-          <w:lang w:val="is-IS"/>
-        </w:rPr>
-      </w:pPr>
+        <w:jc w:val="center"/>
+        <w:rPr>
+          <w:sz w:val="24"/>
+          <w:szCs w:val="24"/>
+          <w:lang w:val="is-IS"/>
+        </w:rPr>
+      </w:pPr>
+      <w:r>
+        <w:rPr>
+          <w:sz w:val="24"/>
+          <w:szCs w:val="24"/>
+          <w:lang w:val="is-IS"/>
+        </w:rPr>
+        <w:drawing>
+          <wp:inline distT="0" distB="0" distL="0" distR="0" wp14:anchorId="6B049459" wp14:editId="3152DA54">
+            <wp:extent cx="2674456" cy="2123024"/>
+            <wp:effectExtent l="0" t="0" r="0" b="0"/>
+            <wp:docPr id="822746279" name="Picture 1" descr="A statue of a person in front of a dome&#10;&#10;AI-generated content may be incorrect."/>
+            <wp:cNvGraphicFramePr>
+              <a:graphicFrameLocks xmlns:a="http://schemas.openxmlformats.org/drawingml/2006/main" noChangeAspect="1"/>
+            </wp:cNvGraphicFramePr>
+            <a:graphic xmlns:a="http://schemas.openxmlformats.org/drawingml/2006/main">
+              <a:graphicData uri="http://schemas.openxmlformats.org/drawingml/2006/picture">
+                <pic:pic xmlns:pic="http://schemas.openxmlformats.org/drawingml/2006/picture">
+                  <pic:nvPicPr>
+                    <pic:cNvPr id="822746279" name="Picture 1" descr="A statue of a person in front of a dome&#10;&#10;AI-generated content may be incorrect."/>
+                    <pic:cNvPicPr/>
+                  </pic:nvPicPr>
+                  <pic:blipFill>
+                    <a:blip r:embed="rId8"/>
+                    <a:stretch>
+                      <a:fillRect/>
+                    </a:stretch>
+                  </pic:blipFill>
+                  <pic:spPr>
+                    <a:xfrm>
+                      <a:off x="0" y="0"/>
+                      <a:ext cx="2690694" cy="2135914"/>
+                    </a:xfrm>
+                    <a:prstGeom prst="rect">
+                      <a:avLst/>
+                    </a:prstGeom>
+                  </pic:spPr>
+                </pic:pic>
+              </a:graphicData>
+            </a:graphic>
+          </wp:inline>
+        </w:drawing>
+      </w:r>
     </w:p>
     <w:p>
       <w:pPr>
@@ -322,7 +302,7 @@
         </w:rPr>
         <w:t xml:space="preserve">HÍ netfang: </w:t>
       </w:r>
-      <w:hyperlink r:id="rId8" w:history="1">
+      <w:hyperlink r:id="rId9" w:history="1">
         <w:r>
           <w:rPr>
             <w:rStyle w:val="Hyperlink"/>
@@ -399,24 +379,14 @@
           <w:szCs w:val="28"/>
           <w:lang w:val="is-IS"/>
         </w:rPr>
-        <w:lastRenderedPageBreak/>
         <w:br w:type="page"/>
       </w:r>
-    </w:p>
-    <w:p>
-      <w:pPr>
+      <w:r>
         <w:rPr>
           <w:sz w:val="28"/>
           <w:szCs w:val="28"/>
           <w:lang w:val="is-IS"/>
         </w:rPr>
-      </w:pPr>
-      <w:r>
-        <w:rPr>
-          <w:sz w:val="28"/>
-          <w:szCs w:val="28"/>
-          <w:lang w:val="is-IS"/>
-        </w:rPr>
         <w:lastRenderedPageBreak/>
         <w:t>Inngangur</w:t>
       </w:r>
@@ -583,6 +553,14 @@
         </w:rPr>
         <w:t>Einkunnargjöf m.t.t. verkefnisins</w:t>
       </w:r>
+      <w:r>
+        <w:rPr>
+          <w:sz w:val="24"/>
+          <w:szCs w:val="24"/>
+          <w:lang w:val="is-IS"/>
+        </w:rPr>
+        <w:t xml:space="preserve"> nú:</w:t>
+      </w:r>
     </w:p>
     <w:p>
       <w:pPr>
@@ -600,6 +578,14 @@
         </w:rPr>
         <w:t xml:space="preserve">Blender hönnun á safninu: </w:t>
       </w:r>
+      <w:r>
+        <w:rPr>
+          <w:sz w:val="24"/>
+          <w:szCs w:val="24"/>
+          <w:lang w:val="is-IS"/>
+        </w:rPr>
+        <w:t>20%</w:t>
+      </w:r>
     </w:p>
     <w:p>
       <w:pPr>
@@ -617,6 +603,14 @@
         </w:rPr>
         <w:t xml:space="preserve">Árstíðarvirkni: </w:t>
       </w:r>
+      <w:r>
+        <w:rPr>
+          <w:sz w:val="24"/>
+          <w:szCs w:val="24"/>
+          <w:lang w:val="is-IS"/>
+        </w:rPr>
+        <w:t>20%</w:t>
+      </w:r>
     </w:p>
     <w:p>
       <w:pPr>
@@ -634,6 +628,14 @@
         </w:rPr>
         <w:t xml:space="preserve">Smellt á styttu með upplýsingum um viðeigandi styttu: </w:t>
       </w:r>
+      <w:r>
+        <w:rPr>
+          <w:sz w:val="24"/>
+          <w:szCs w:val="24"/>
+          <w:lang w:val="is-IS"/>
+        </w:rPr>
+        <w:t>20%</w:t>
+      </w:r>
     </w:p>
     <w:p>
       <w:pPr>
@@ -651,6 +653,14 @@
         </w:rPr>
         <w:t xml:space="preserve">Niðurhal á styttu: </w:t>
       </w:r>
+      <w:r>
+        <w:rPr>
+          <w:sz w:val="24"/>
+          <w:szCs w:val="24"/>
+          <w:lang w:val="is-IS"/>
+        </w:rPr>
+        <w:t>20%</w:t>
+      </w:r>
     </w:p>
     <w:p>
       <w:pPr>
@@ -674,7 +684,7 @@
           <w:szCs w:val="24"/>
           <w:lang w:val="is-IS"/>
         </w:rPr>
-        <w:t>.</w:t>
+        <w:t>: 20%</w:t>
       </w:r>
     </w:p>
     <w:p>
@@ -1159,23 +1169,31 @@
           <w:lang w:val="is-IS"/>
         </w:rPr>
         <w:lastRenderedPageBreak/>
-        <w:t>Hér er verkáætlunin mín</w:t>
-      </w:r>
-      <w:r>
-        <w:rPr>
-          <w:sz w:val="24"/>
-          <w:szCs w:val="24"/>
-          <w:lang w:val="is-IS"/>
-        </w:rPr>
-        <w:t xml:space="preserve"> í my</w:t>
-      </w:r>
-      <w:r>
-        <w:rPr>
-          <w:sz w:val="24"/>
-          <w:szCs w:val="24"/>
-          <w:lang w:val="is-IS"/>
-        </w:rPr>
-        <w:t>ndum:</w:t>
+        <w:t xml:space="preserve">Hér </w:t>
+      </w:r>
+      <w:r>
+        <w:rPr>
+          <w:sz w:val="24"/>
+          <w:szCs w:val="24"/>
+          <w:lang w:val="is-IS"/>
+        </w:rPr>
+        <w:t>var</w:t>
+      </w:r>
+      <w:r>
+        <w:rPr>
+          <w:sz w:val="24"/>
+          <w:szCs w:val="24"/>
+          <w:lang w:val="is-IS"/>
+        </w:rPr>
+        <w:t xml:space="preserve"> verkáætlunin mín</w:t>
+      </w:r>
+      <w:r>
+        <w:rPr>
+          <w:sz w:val="24"/>
+          <w:szCs w:val="24"/>
+          <w:lang w:val="is-IS"/>
+        </w:rPr>
+        <w:t xml:space="preserve"> sem ég bjó til í viku 6. </w:t>
       </w:r>
     </w:p>
     <w:p>
@@ -1194,9 +1212,9 @@
           <w:lang w:val="is-IS"/>
         </w:rPr>
         <w:drawing>
-          <wp:inline distT="0" distB="0" distL="0" distR="0" wp14:anchorId="64557349" wp14:editId="1F2F88F3">
-            <wp:extent cx="5334274" cy="2762392"/>
-            <wp:effectExtent l="152400" t="152400" r="361950" b="361950"/>
+          <wp:inline distT="0" distB="0" distL="0" distR="0" wp14:anchorId="64557349" wp14:editId="7D6131FD">
+            <wp:extent cx="5108756" cy="2645606"/>
+            <wp:effectExtent l="152400" t="152400" r="358775" b="364490"/>
             <wp:docPr id="209870381" name="Picture 1" descr="A screenshot of a computer&#10;&#10;AI-generated content may be incorrect."/>
             <wp:cNvGraphicFramePr>
               <a:graphicFrameLocks xmlns:a="http://schemas.openxmlformats.org/drawingml/2006/main" noChangeAspect="1"/>
@@ -1209,7 +1227,7 @@
                     <pic:cNvPicPr/>
                   </pic:nvPicPr>
                   <pic:blipFill>
-                    <a:blip r:embed="rId9"/>
+                    <a:blip r:embed="rId10"/>
                     <a:stretch>
                       <a:fillRect/>
                     </a:stretch>
@@ -1217,7 +1235,7 @@
                   <pic:spPr>
                     <a:xfrm>
                       <a:off x="0" y="0"/>
-                      <a:ext cx="5334274" cy="2762392"/>
+                      <a:ext cx="5109949" cy="2646224"/>
                     </a:xfrm>
                     <a:prstGeom prst="rect">
                       <a:avLst/>
@@ -1239,14 +1257,6 @@
           </wp:inline>
         </w:drawing>
       </w:r>
-      <w:r>
-        <w:rPr>
-          <w:sz w:val="24"/>
-          <w:szCs w:val="24"/>
-          <w:lang w:val="is-IS"/>
-        </w:rPr>
-        <w:t xml:space="preserve"> </w:t>
-      </w:r>
     </w:p>
     <w:p>
       <w:pPr>
@@ -1264,9 +1274,9 @@
           <w:lang w:val="is-IS"/>
         </w:rPr>
         <w:drawing>
-          <wp:inline distT="0" distB="0" distL="0" distR="0" wp14:anchorId="5135FDE9" wp14:editId="2AB233E0">
-            <wp:extent cx="5267596" cy="3686364"/>
-            <wp:effectExtent l="152400" t="152400" r="371475" b="352425"/>
+          <wp:inline distT="0" distB="0" distL="0" distR="0" wp14:anchorId="5135FDE9" wp14:editId="5F3E64B2">
+            <wp:extent cx="4996358" cy="3496546"/>
+            <wp:effectExtent l="152400" t="152400" r="356870" b="370840"/>
             <wp:docPr id="1547095036" name="Picture 1" descr="A screenshot of a computer&#10;&#10;AI-generated content may be incorrect."/>
             <wp:cNvGraphicFramePr>
               <a:graphicFrameLocks xmlns:a="http://schemas.openxmlformats.org/drawingml/2006/main" noChangeAspect="1"/>
@@ -1279,7 +1289,7 @@
                     <pic:cNvPicPr/>
                   </pic:nvPicPr>
                   <pic:blipFill>
-                    <a:blip r:embed="rId10"/>
+                    <a:blip r:embed="rId11"/>
                     <a:stretch>
                       <a:fillRect/>
                     </a:stretch>
@@ -1287,7 +1297,7 @@
                   <pic:spPr>
                     <a:xfrm>
                       <a:off x="0" y="0"/>
-                      <a:ext cx="5267596" cy="3686364"/>
+                      <a:ext cx="4999716" cy="3498896"/>
                     </a:xfrm>
                     <a:prstGeom prst="rect">
                       <a:avLst/>
@@ -1327,9 +1337,9 @@
         </w:rPr>
         <w:lastRenderedPageBreak/>
         <w:drawing>
-          <wp:inline distT="0" distB="0" distL="0" distR="0" wp14:anchorId="65272909" wp14:editId="1798E361">
-            <wp:extent cx="5274110" cy="2282982"/>
-            <wp:effectExtent l="152400" t="152400" r="365125" b="365125"/>
+          <wp:inline distT="0" distB="0" distL="0" distR="0" wp14:anchorId="65272909" wp14:editId="0F93BFF4">
+            <wp:extent cx="4950356" cy="2142840"/>
+            <wp:effectExtent l="152400" t="152400" r="365125" b="353060"/>
             <wp:docPr id="501286232" name="Picture 1" descr="A white background with black text&#10;&#10;AI-generated content may be incorrect."/>
             <wp:cNvGraphicFramePr>
               <a:graphicFrameLocks xmlns:a="http://schemas.openxmlformats.org/drawingml/2006/main" noChangeAspect="1"/>
@@ -1342,7 +1352,7 @@
                     <pic:cNvPicPr/>
                   </pic:nvPicPr>
                   <pic:blipFill>
-                    <a:blip r:embed="rId11"/>
+                    <a:blip r:embed="rId12"/>
                     <a:stretch>
                       <a:fillRect/>
                     </a:stretch>
@@ -1350,7 +1360,7 @@
                   <pic:spPr>
                     <a:xfrm>
                       <a:off x="0" y="0"/>
-                      <a:ext cx="5286721" cy="2288441"/>
+                      <a:ext cx="4971253" cy="2151885"/>
                     </a:xfrm>
                     <a:prstGeom prst="rect">
                       <a:avLst/>
@@ -1389,9 +1399,9 @@
           <w:lang w:val="is-IS"/>
         </w:rPr>
         <w:drawing>
-          <wp:inline distT="0" distB="0" distL="0" distR="0" wp14:anchorId="7B5B4330" wp14:editId="7FD847C7">
-            <wp:extent cx="5381902" cy="2067031"/>
-            <wp:effectExtent l="152400" t="152400" r="371475" b="371475"/>
+          <wp:inline distT="0" distB="0" distL="0" distR="0" wp14:anchorId="7B5B4330" wp14:editId="60529287">
+            <wp:extent cx="4964779" cy="1906827"/>
+            <wp:effectExtent l="152400" t="152400" r="369570" b="360680"/>
             <wp:docPr id="552194639" name="Picture 1" descr="A screenshot of a computer&#10;&#10;AI-generated content may be incorrect."/>
             <wp:cNvGraphicFramePr>
               <a:graphicFrameLocks xmlns:a="http://schemas.openxmlformats.org/drawingml/2006/main" noChangeAspect="1"/>
@@ -1404,7 +1414,7 @@
                     <pic:cNvPicPr/>
                   </pic:nvPicPr>
                   <pic:blipFill>
-                    <a:blip r:embed="rId12"/>
+                    <a:blip r:embed="rId13"/>
                     <a:stretch>
                       <a:fillRect/>
                     </a:stretch>
@@ -1412,7 +1422,7 @@
                   <pic:spPr>
                     <a:xfrm>
                       <a:off x="0" y="0"/>
-                      <a:ext cx="5381902" cy="2067031"/>
+                      <a:ext cx="4976429" cy="1911301"/>
                     </a:xfrm>
                     <a:prstGeom prst="rect">
                       <a:avLst/>
@@ -1451,9 +1461,9 @@
           <w:lang w:val="is-IS"/>
         </w:rPr>
         <w:drawing>
-          <wp:inline distT="0" distB="0" distL="0" distR="0" wp14:anchorId="7E954D87" wp14:editId="5AC186B5">
-            <wp:extent cx="5229494" cy="2324219"/>
-            <wp:effectExtent l="152400" t="152400" r="371475" b="361950"/>
+          <wp:inline distT="0" distB="0" distL="0" distR="0" wp14:anchorId="7E954D87" wp14:editId="364930C2">
+            <wp:extent cx="4898434" cy="2177081"/>
+            <wp:effectExtent l="152400" t="152400" r="359410" b="356870"/>
             <wp:docPr id="659550436" name="Picture 1" descr="A screenshot of a computer&#10;&#10;AI-generated content may be incorrect."/>
             <wp:cNvGraphicFramePr>
               <a:graphicFrameLocks xmlns:a="http://schemas.openxmlformats.org/drawingml/2006/main" noChangeAspect="1"/>
@@ -1466,7 +1476,7 @@
                     <pic:cNvPicPr/>
                   </pic:nvPicPr>
                   <pic:blipFill>
-                    <a:blip r:embed="rId13"/>
+                    <a:blip r:embed="rId14"/>
                     <a:stretch>
                       <a:fillRect/>
                     </a:stretch>
@@ -1474,7 +1484,7 @@
                   <pic:spPr>
                     <a:xfrm>
                       <a:off x="0" y="0"/>
-                      <a:ext cx="5229494" cy="2324219"/>
+                      <a:ext cx="4908745" cy="2181664"/>
                     </a:xfrm>
                     <a:prstGeom prst="rect">
                       <a:avLst/>
@@ -1514,9 +1524,9 @@
         </w:rPr>
         <w:lastRenderedPageBreak/>
         <w:drawing>
-          <wp:inline distT="0" distB="0" distL="0" distR="0" wp14:anchorId="5E632EE5" wp14:editId="062E44FC">
-            <wp:extent cx="5200917" cy="2267067"/>
-            <wp:effectExtent l="152400" t="152400" r="361950" b="361950"/>
+          <wp:inline distT="0" distB="0" distL="0" distR="0" wp14:anchorId="5E632EE5" wp14:editId="0A83605B">
+            <wp:extent cx="4765745" cy="2077376"/>
+            <wp:effectExtent l="152400" t="152400" r="358775" b="361315"/>
             <wp:docPr id="403693449" name="Picture 1" descr="A white background with black text&#10;&#10;AI-generated content may be incorrect."/>
             <wp:cNvGraphicFramePr>
               <a:graphicFrameLocks xmlns:a="http://schemas.openxmlformats.org/drawingml/2006/main" noChangeAspect="1"/>
@@ -1529,7 +1539,7 @@
                     <pic:cNvPicPr/>
                   </pic:nvPicPr>
                   <pic:blipFill>
-                    <a:blip r:embed="rId14"/>
+                    <a:blip r:embed="rId15"/>
                     <a:stretch>
                       <a:fillRect/>
                     </a:stretch>
@@ -1537,7 +1547,7 @@
                   <pic:spPr>
                     <a:xfrm>
                       <a:off x="0" y="0"/>
-                      <a:ext cx="5200917" cy="2267067"/>
+                      <a:ext cx="4773463" cy="2080740"/>
                     </a:xfrm>
                     <a:prstGeom prst="rect">
                       <a:avLst/>
@@ -1576,9 +1586,9 @@
           <w:lang w:val="is-IS"/>
         </w:rPr>
         <w:drawing>
-          <wp:inline distT="0" distB="0" distL="0" distR="0" wp14:anchorId="65AEC80E" wp14:editId="3A632208">
-            <wp:extent cx="5562886" cy="2248016"/>
-            <wp:effectExtent l="152400" t="152400" r="361950" b="361950"/>
+          <wp:inline distT="0" distB="0" distL="0" distR="0" wp14:anchorId="65AEC80E" wp14:editId="792ABE51">
+            <wp:extent cx="4788821" cy="1935209"/>
+            <wp:effectExtent l="152400" t="152400" r="354965" b="370205"/>
             <wp:docPr id="584573816" name="Picture 1" descr="A screenshot of a computer&#10;&#10;AI-generated content may be incorrect."/>
             <wp:cNvGraphicFramePr>
               <a:graphicFrameLocks xmlns:a="http://schemas.openxmlformats.org/drawingml/2006/main" noChangeAspect="1"/>
@@ -1591,7 +1601,7 @@
                     <pic:cNvPicPr/>
                   </pic:nvPicPr>
                   <pic:blipFill>
-                    <a:blip r:embed="rId15"/>
+                    <a:blip r:embed="rId16"/>
                     <a:stretch>
                       <a:fillRect/>
                     </a:stretch>
@@ -1599,7 +1609,7 @@
                   <pic:spPr>
                     <a:xfrm>
                       <a:off x="0" y="0"/>
-                      <a:ext cx="5562886" cy="2248016"/>
+                      <a:ext cx="4798211" cy="1939004"/>
                     </a:xfrm>
                     <a:prstGeom prst="rect">
                       <a:avLst/>
@@ -1630,6 +1640,15 @@
           <w:lang w:val="is-IS"/>
         </w:rPr>
       </w:pPr>
+    </w:p>
+    <w:p>
+      <w:pPr>
+        <w:rPr>
+          <w:sz w:val="24"/>
+          <w:szCs w:val="24"/>
+          <w:lang w:val="is-IS"/>
+        </w:rPr>
+      </w:pPr>
       <w:r>
         <w:rPr>
           <w:noProof/>
@@ -1637,11 +1656,10 @@
           <w:szCs w:val="24"/>
           <w:lang w:val="is-IS"/>
         </w:rPr>
-        <w:lastRenderedPageBreak/>
         <w:drawing>
-          <wp:inline distT="0" distB="0" distL="0" distR="0" wp14:anchorId="1BFAD002" wp14:editId="6938335C">
-            <wp:extent cx="5486682" cy="2629035"/>
-            <wp:effectExtent l="152400" t="152400" r="361950" b="361950"/>
+          <wp:inline distT="0" distB="0" distL="0" distR="0" wp14:anchorId="137A1C74" wp14:editId="4EA257B8">
+            <wp:extent cx="4777283" cy="2289115"/>
+            <wp:effectExtent l="152400" t="152400" r="366395" b="359410"/>
             <wp:docPr id="1425432769" name="Picture 1" descr="A screenshot of a computer&#10;&#10;AI-generated content may be incorrect."/>
             <wp:cNvGraphicFramePr>
               <a:graphicFrameLocks xmlns:a="http://schemas.openxmlformats.org/drawingml/2006/main" noChangeAspect="1"/>
@@ -1654,7 +1672,7 @@
                     <pic:cNvPicPr/>
                   </pic:nvPicPr>
                   <pic:blipFill>
-                    <a:blip r:embed="rId16"/>
+                    <a:blip r:embed="rId17"/>
                     <a:stretch>
                       <a:fillRect/>
                     </a:stretch>
@@ -1662,7 +1680,7 @@
                   <pic:spPr>
                     <a:xfrm>
                       <a:off x="0" y="0"/>
-                      <a:ext cx="5486682" cy="2629035"/>
+                      <a:ext cx="4789641" cy="2295036"/>
                     </a:xfrm>
                     <a:prstGeom prst="rect">
                       <a:avLst/>
@@ -1693,21 +1711,495 @@
           <w:lang w:val="is-IS"/>
         </w:rPr>
       </w:pPr>
-      <w:r>
-        <w:rPr>
-          <w:sz w:val="24"/>
-          <w:szCs w:val="24"/>
-          <w:lang w:val="is-IS"/>
-        </w:rPr>
-        <w:t xml:space="preserve">Ég byrjaði að setja upp umhverfið: ásmundarsafn og </w:t>
-      </w:r>
-      <w:r>
-        <w:rPr>
-          <w:sz w:val="24"/>
-          <w:szCs w:val="24"/>
-          <w:lang w:val="is-IS"/>
-        </w:rPr>
-        <w:t>planið fyrir grasflötinn í garðinum</w:t>
+    </w:p>
+    <w:p>
+      <w:pPr>
+        <w:rPr>
+          <w:sz w:val="24"/>
+          <w:szCs w:val="24"/>
+          <w:lang w:val="is-IS"/>
+        </w:rPr>
+      </w:pPr>
+      <w:r>
+        <w:rPr>
+          <w:sz w:val="24"/>
+          <w:szCs w:val="24"/>
+          <w:lang w:val="is-IS"/>
+        </w:rPr>
+        <w:lastRenderedPageBreak/>
+        <w:t xml:space="preserve">Hér segi ég hvernig ferlið mitt endaði á að vera: </w:t>
+      </w:r>
+    </w:p>
+    <w:p>
+      <w:pPr>
+        <w:rPr>
+          <w:sz w:val="24"/>
+          <w:szCs w:val="24"/>
+          <w:lang w:val="is-IS"/>
+        </w:rPr>
+      </w:pPr>
+      <w:r>
+        <w:rPr>
+          <w:sz w:val="24"/>
+          <w:szCs w:val="24"/>
+          <w:lang w:val="is-IS"/>
+        </w:rPr>
+        <w:t xml:space="preserve">Vika 6: </w:t>
+      </w:r>
+      <w:r>
+        <w:rPr>
+          <w:sz w:val="24"/>
+          <w:szCs w:val="24"/>
+          <w:lang w:val="is-IS"/>
+        </w:rPr>
+        <w:t>Ég byrjaði að setja upp umhverfið</w:t>
+      </w:r>
+      <w:r>
+        <w:rPr>
+          <w:sz w:val="24"/>
+          <w:szCs w:val="24"/>
+          <w:lang w:val="is-IS"/>
+        </w:rPr>
+        <w:t>, sem var kassi sem var staðsetningin á</w:t>
+      </w:r>
+      <w:r>
+        <w:rPr>
+          <w:sz w:val="24"/>
+          <w:szCs w:val="24"/>
+          <w:lang w:val="is-IS"/>
+        </w:rPr>
+        <w:t xml:space="preserve"> ásmundarsafn</w:t>
+      </w:r>
+      <w:r>
+        <w:rPr>
+          <w:sz w:val="24"/>
+          <w:szCs w:val="24"/>
+          <w:lang w:val="is-IS"/>
+        </w:rPr>
+        <w:t>i</w:t>
+      </w:r>
+      <w:r>
+        <w:rPr>
+          <w:sz w:val="24"/>
+          <w:szCs w:val="24"/>
+          <w:lang w:val="is-IS"/>
+        </w:rPr>
+        <w:t xml:space="preserve"> og </w:t>
+      </w:r>
+      <w:r>
+        <w:rPr>
+          <w:sz w:val="24"/>
+          <w:szCs w:val="24"/>
+          <w:lang w:val="is-IS"/>
+        </w:rPr>
+        <w:t>planið fyrir grasflötinn í garðinum.</w:t>
+      </w:r>
+    </w:p>
+    <w:p>
+      <w:pPr>
+        <w:rPr>
+          <w:sz w:val="24"/>
+          <w:szCs w:val="24"/>
+          <w:lang w:val="is-IS"/>
+        </w:rPr>
+      </w:pPr>
+      <w:r>
+        <w:rPr>
+          <w:noProof/>
+          <w:sz w:val="24"/>
+          <w:szCs w:val="24"/>
+          <w:lang w:val="is-IS"/>
+        </w:rPr>
+        <w:drawing>
+          <wp:anchor distT="0" distB="0" distL="114300" distR="114300" simplePos="0" relativeHeight="251658240" behindDoc="0" locked="0" layoutInCell="1" allowOverlap="1" wp14:anchorId="64D38FFC" wp14:editId="0B0690BF">
+            <wp:simplePos x="0" y="0"/>
+            <wp:positionH relativeFrom="margin">
+              <wp:align>left</wp:align>
+            </wp:positionH>
+            <wp:positionV relativeFrom="paragraph">
+              <wp:posOffset>428847</wp:posOffset>
+            </wp:positionV>
+            <wp:extent cx="2614930" cy="1612265"/>
+            <wp:effectExtent l="0" t="0" r="0" b="6985"/>
+            <wp:wrapThrough wrapText="bothSides">
+              <wp:wrapPolygon edited="0">
+                <wp:start x="0" y="0"/>
+                <wp:lineTo x="0" y="21438"/>
+                <wp:lineTo x="21401" y="21438"/>
+                <wp:lineTo x="21401" y="0"/>
+                <wp:lineTo x="0" y="0"/>
+              </wp:wrapPolygon>
+            </wp:wrapThrough>
+            <wp:docPr id="52058298" name="Picture 1" descr="A screenshot of a computer program&#10;&#10;AI-generated content may be incorrect."/>
+            <wp:cNvGraphicFramePr>
+              <a:graphicFrameLocks xmlns:a="http://schemas.openxmlformats.org/drawingml/2006/main" noChangeAspect="1"/>
+            </wp:cNvGraphicFramePr>
+            <a:graphic xmlns:a="http://schemas.openxmlformats.org/drawingml/2006/main">
+              <a:graphicData uri="http://schemas.openxmlformats.org/drawingml/2006/picture">
+                <pic:pic xmlns:pic="http://schemas.openxmlformats.org/drawingml/2006/picture">
+                  <pic:nvPicPr>
+                    <pic:cNvPr id="52058298" name="Picture 1" descr="A screenshot of a computer program&#10;&#10;AI-generated content may be incorrect."/>
+                    <pic:cNvPicPr/>
+                  </pic:nvPicPr>
+                  <pic:blipFill>
+                    <a:blip r:embed="rId18">
+                      <a:extLst>
+                        <a:ext uri="{28A0092B-C50C-407E-A947-70E740481C1C}">
+                          <a14:useLocalDpi xmlns:a14="http://schemas.microsoft.com/office/drawing/2010/main" val="0"/>
+                        </a:ext>
+                      </a:extLst>
+                    </a:blip>
+                    <a:stretch>
+                      <a:fillRect/>
+                    </a:stretch>
+                  </pic:blipFill>
+                  <pic:spPr>
+                    <a:xfrm>
+                      <a:off x="0" y="0"/>
+                      <a:ext cx="2620659" cy="1615897"/>
+                    </a:xfrm>
+                    <a:prstGeom prst="rect">
+                      <a:avLst/>
+                    </a:prstGeom>
+                  </pic:spPr>
+                </pic:pic>
+              </a:graphicData>
+            </a:graphic>
+            <wp14:sizeRelH relativeFrom="margin">
+              <wp14:pctWidth>0</wp14:pctWidth>
+            </wp14:sizeRelH>
+            <wp14:sizeRelV relativeFrom="margin">
+              <wp14:pctHeight>0</wp14:pctHeight>
+            </wp14:sizeRelV>
+          </wp:anchor>
+        </w:drawing>
+      </w:r>
+      <w:r>
+        <w:rPr>
+          <w:sz w:val="24"/>
+          <w:szCs w:val="24"/>
+          <w:lang w:val="is-IS"/>
+        </w:rPr>
+        <w:t xml:space="preserve">Vika 7: Ég bjó til kóðann sem sá um að skipta skipta um umhverfi: seasons.js sér um þá virkni og mæli með að skoða kóðann þar. </w:t>
+      </w:r>
+    </w:p>
+    <w:p>
+      <w:pPr>
+        <w:rPr>
+          <w:sz w:val="24"/>
+          <w:szCs w:val="24"/>
+          <w:lang w:val="is-IS"/>
+        </w:rPr>
+      </w:pPr>
+    </w:p>
+    <w:p>
+      <w:pPr>
+        <w:rPr>
+          <w:sz w:val="24"/>
+          <w:szCs w:val="24"/>
+          <w:lang w:val="is-IS"/>
+        </w:rPr>
+      </w:pPr>
+    </w:p>
+    <w:p>
+      <w:pPr>
+        <w:rPr>
+          <w:sz w:val="24"/>
+          <w:szCs w:val="24"/>
+          <w:lang w:val="is-IS"/>
+        </w:rPr>
+      </w:pPr>
+    </w:p>
+    <w:p>
+      <w:pPr>
+        <w:rPr>
+          <w:sz w:val="24"/>
+          <w:szCs w:val="24"/>
+          <w:lang w:val="is-IS"/>
+        </w:rPr>
+      </w:pPr>
+    </w:p>
+    <w:p>
+      <w:pPr>
+        <w:rPr>
+          <w:sz w:val="24"/>
+          <w:szCs w:val="24"/>
+          <w:lang w:val="is-IS"/>
+        </w:rPr>
+      </w:pPr>
+      <w:r>
+        <w:rPr>
+          <w:noProof/>
+          <w:sz w:val="24"/>
+          <w:szCs w:val="24"/>
+          <w:lang w:val="is-IS"/>
+        </w:rPr>
+        <w:drawing>
+          <wp:anchor distT="0" distB="0" distL="114300" distR="114300" simplePos="0" relativeHeight="251659264" behindDoc="0" locked="0" layoutInCell="1" allowOverlap="1" wp14:anchorId="7560B652" wp14:editId="27D57B2D">
+            <wp:simplePos x="0" y="0"/>
+            <wp:positionH relativeFrom="column">
+              <wp:posOffset>3383569</wp:posOffset>
+            </wp:positionH>
+            <wp:positionV relativeFrom="paragraph">
+              <wp:posOffset>222146</wp:posOffset>
+            </wp:positionV>
+            <wp:extent cx="2238490" cy="1304992"/>
+            <wp:effectExtent l="0" t="0" r="9525" b="9525"/>
+            <wp:wrapThrough wrapText="bothSides">
+              <wp:wrapPolygon edited="0">
+                <wp:start x="0" y="0"/>
+                <wp:lineTo x="0" y="21442"/>
+                <wp:lineTo x="21508" y="21442"/>
+                <wp:lineTo x="21508" y="0"/>
+                <wp:lineTo x="0" y="0"/>
+              </wp:wrapPolygon>
+            </wp:wrapThrough>
+            <wp:docPr id="1413281913" name="Picture 1" descr="A computer screen shot of a code&#10;&#10;AI-generated content may be incorrect."/>
+            <wp:cNvGraphicFramePr>
+              <a:graphicFrameLocks xmlns:a="http://schemas.openxmlformats.org/drawingml/2006/main" noChangeAspect="1"/>
+            </wp:cNvGraphicFramePr>
+            <a:graphic xmlns:a="http://schemas.openxmlformats.org/drawingml/2006/main">
+              <a:graphicData uri="http://schemas.openxmlformats.org/drawingml/2006/picture">
+                <pic:pic xmlns:pic="http://schemas.openxmlformats.org/drawingml/2006/picture">
+                  <pic:nvPicPr>
+                    <pic:cNvPr id="1413281913" name="Picture 1" descr="A computer screen shot of a code&#10;&#10;AI-generated content may be incorrect."/>
+                    <pic:cNvPicPr/>
+                  </pic:nvPicPr>
+                  <pic:blipFill>
+                    <a:blip r:embed="rId19" cstate="print">
+                      <a:extLst>
+                        <a:ext uri="{28A0092B-C50C-407E-A947-70E740481C1C}">
+                          <a14:useLocalDpi xmlns:a14="http://schemas.microsoft.com/office/drawing/2010/main" val="0"/>
+                        </a:ext>
+                      </a:extLst>
+                    </a:blip>
+                    <a:stretch>
+                      <a:fillRect/>
+                    </a:stretch>
+                  </pic:blipFill>
+                  <pic:spPr>
+                    <a:xfrm>
+                      <a:off x="0" y="0"/>
+                      <a:ext cx="2238490" cy="1304992"/>
+                    </a:xfrm>
+                    <a:prstGeom prst="rect">
+                      <a:avLst/>
+                    </a:prstGeom>
+                  </pic:spPr>
+                </pic:pic>
+              </a:graphicData>
+            </a:graphic>
+          </wp:anchor>
+        </w:drawing>
+      </w:r>
+    </w:p>
+    <w:p>
+      <w:pPr>
+        <w:rPr>
+          <w:sz w:val="24"/>
+          <w:szCs w:val="24"/>
+          <w:lang w:val="is-IS"/>
+        </w:rPr>
+      </w:pPr>
+    </w:p>
+    <w:p>
+      <w:pPr>
+        <w:rPr>
+          <w:sz w:val="24"/>
+          <w:szCs w:val="24"/>
+          <w:lang w:val="is-IS"/>
+        </w:rPr>
+      </w:pPr>
+      <w:r>
+        <w:rPr>
+          <w:sz w:val="24"/>
+          <w:szCs w:val="24"/>
+          <w:lang w:val="is-IS"/>
+        </w:rPr>
+        <w:t>Til dæmis fyrir bakgrunninn notaði ég switch case kóðun</w:t>
+      </w:r>
+      <w:r>
+        <w:rPr>
+          <w:sz w:val="24"/>
+          <w:szCs w:val="24"/>
+          <w:lang w:val="is-IS"/>
+        </w:rPr>
+        <w:t xml:space="preserve">. </w:t>
+      </w:r>
+    </w:p>
+    <w:p>
+      <w:pPr>
+        <w:rPr>
+          <w:sz w:val="24"/>
+          <w:szCs w:val="24"/>
+          <w:lang w:val="is-IS"/>
+        </w:rPr>
+      </w:pPr>
+    </w:p>
+    <w:p>
+      <w:pPr>
+        <w:rPr>
+          <w:sz w:val="24"/>
+          <w:szCs w:val="24"/>
+          <w:lang w:val="is-IS"/>
+        </w:rPr>
+      </w:pPr>
+    </w:p>
+    <w:p>
+      <w:pPr>
+        <w:rPr>
+          <w:sz w:val="24"/>
+          <w:szCs w:val="24"/>
+          <w:lang w:val="is-IS"/>
+        </w:rPr>
+      </w:pPr>
+      <w:r>
+        <w:rPr>
+          <w:sz w:val="24"/>
+          <w:szCs w:val="24"/>
+          <w:lang w:val="is-IS"/>
+        </w:rPr>
+        <w:t xml:space="preserve">Vika 8: </w:t>
+      </w:r>
+      <w:r>
+        <w:rPr>
+          <w:sz w:val="24"/>
+          <w:szCs w:val="24"/>
+          <w:lang w:val="is-IS"/>
+        </w:rPr>
+        <w:t>Tók</w:t>
+      </w:r>
+      <w:r>
+        <w:rPr>
+          <w:sz w:val="24"/>
+          <w:szCs w:val="24"/>
+          <w:lang w:val="is-IS"/>
+        </w:rPr>
+        <w:t xml:space="preserve"> myn</w:t>
+      </w:r>
+      <w:r>
+        <w:rPr>
+          <w:sz w:val="24"/>
+          <w:szCs w:val="24"/>
+          <w:lang w:val="is-IS"/>
+        </w:rPr>
+        <w:t>d</w:t>
+      </w:r>
+      <w:r>
+        <w:rPr>
+          <w:sz w:val="24"/>
+          <w:szCs w:val="24"/>
+          <w:lang w:val="is-IS"/>
+        </w:rPr>
+        <w:t>ir af öllum styttunum í garðinum og myndum af nafninu á hverrri styttu</w:t>
+      </w:r>
+      <w:r>
+        <w:rPr>
+          <w:sz w:val="24"/>
+          <w:szCs w:val="24"/>
+          <w:lang w:val="is-IS"/>
+        </w:rPr>
+        <w:t>, og vann einnig áfram í að bæta seasons.js.</w:t>
+      </w:r>
+    </w:p>
+    <w:p>
+      <w:pPr>
+        <w:rPr>
+          <w:sz w:val="24"/>
+          <w:szCs w:val="24"/>
+          <w:lang w:val="is-IS"/>
+        </w:rPr>
+      </w:pPr>
+      <w:r>
+        <w:rPr>
+          <w:sz w:val="24"/>
+          <w:szCs w:val="24"/>
+          <w:lang w:val="is-IS"/>
+        </w:rPr>
+        <w:t>Vika 9:</w:t>
+      </w:r>
+      <w:r>
+        <w:rPr>
+          <w:sz w:val="24"/>
+          <w:szCs w:val="24"/>
+          <w:lang w:val="is-IS"/>
+        </w:rPr>
+        <w:t xml:space="preserve"> </w:t>
+      </w:r>
+      <w:r>
+        <w:rPr>
+          <w:sz w:val="24"/>
+          <w:szCs w:val="24"/>
+          <w:lang w:val="is-IS"/>
+        </w:rPr>
+        <w:t>Settti upplýsingar</w:t>
+      </w:r>
+      <w:r>
+        <w:rPr>
+          <w:sz w:val="24"/>
+          <w:szCs w:val="24"/>
+          <w:lang w:val="is-IS"/>
+        </w:rPr>
+        <w:t>nar af styttunum</w:t>
+      </w:r>
+      <w:r>
+        <w:rPr>
+          <w:sz w:val="24"/>
+          <w:szCs w:val="24"/>
+          <w:lang w:val="is-IS"/>
+        </w:rPr>
+        <w:t xml:space="preserve"> í json skjal.</w:t>
+      </w:r>
+      <w:r>
+        <w:rPr>
+          <w:sz w:val="24"/>
+          <w:szCs w:val="24"/>
+          <w:lang w:val="is-IS"/>
+        </w:rPr>
+        <w:t xml:space="preserve"> </w:t>
+      </w:r>
+    </w:p>
+    <w:p>
+      <w:pPr>
+        <w:rPr>
+          <w:sz w:val="24"/>
+          <w:szCs w:val="24"/>
+          <w:lang w:val="is-IS"/>
+        </w:rPr>
+      </w:pPr>
+      <w:r>
+        <w:rPr>
+          <w:sz w:val="24"/>
+          <w:szCs w:val="24"/>
+          <w:lang w:val="is-IS"/>
+        </w:rPr>
+        <w:t>Ég hlóð sína Polycam appinu á símann minn og byrjaði að skanna stytturnar. Þar sem ég var með viku free trial notaði ég þessa viku í það. Ég hlóð niður styttunum í icloudið og náði í þær í tölvunni síðan.</w:t>
+      </w:r>
+    </w:p>
+    <w:p>
+      <w:pPr>
+        <w:rPr>
+          <w:sz w:val="24"/>
+          <w:szCs w:val="24"/>
+          <w:lang w:val="is-IS"/>
+        </w:rPr>
+      </w:pPr>
+      <w:r>
+        <w:rPr>
+          <w:sz w:val="24"/>
+          <w:szCs w:val="24"/>
+          <w:lang w:val="is-IS"/>
+        </w:rPr>
+        <w:tab/>
+        <w:t xml:space="preserve">Auk þess vann ég í að læra hvernig raytracer virkar í three js. Ég notaði þeirra æfingarefni til þess að skilja það betur. Hægt er að ná í það efni á </w:t>
+      </w:r>
+      <w:r>
+        <w:rPr>
+          <w:sz w:val="24"/>
+          <w:szCs w:val="24"/>
+          <w:lang w:val="is-IS"/>
+        </w:rPr>
+        <w:t>https://threejs.org/</w:t>
       </w:r>
       <w:r>
         <w:rPr>
@@ -1732,33 +2224,105 @@
           <w:szCs w:val="24"/>
           <w:lang w:val="is-IS"/>
         </w:rPr>
-        <w:t xml:space="preserve">Ég setti árstíðarkviku </w:t>
-      </w:r>
-      <w:r>
-        <w:rPr>
-          <w:sz w:val="24"/>
-          <w:szCs w:val="24"/>
-          <w:lang w:val="is-IS"/>
-        </w:rPr>
-        <w:t>fyrir umhverfið</w:t>
-      </w:r>
-      <w:r>
-        <w:rPr>
-          <w:sz w:val="24"/>
-          <w:szCs w:val="24"/>
-          <w:lang w:val="is-IS"/>
-        </w:rPr>
-        <w:t xml:space="preserve"> og það var gert með því að ...</w:t>
-      </w:r>
-    </w:p>
-    <w:p>
-      <w:pPr>
-        <w:rPr>
-          <w:sz w:val="24"/>
-          <w:szCs w:val="24"/>
-          <w:lang w:val="is-IS"/>
-        </w:rPr>
-      </w:pPr>
+        <w:t xml:space="preserve">Vika 10: </w:t>
+      </w:r>
+      <w:r>
+        <w:rPr>
+          <w:sz w:val="24"/>
+          <w:szCs w:val="24"/>
+          <w:lang w:val="is-IS"/>
+        </w:rPr>
+        <w:t xml:space="preserve">Ég reyndi að hýsa verkefnið á Render en gögnin voru of stór og gat ekki leyst það. </w:t>
+      </w:r>
+      <w:r>
+        <w:rPr>
+          <w:sz w:val="24"/>
+          <w:szCs w:val="24"/>
+          <w:lang w:val="is-IS"/>
+        </w:rPr>
+        <w:t>Síðan setti ég placeholder styttu</w:t>
+      </w:r>
+      <w:r>
+        <w:rPr>
+          <w:sz w:val="24"/>
+          <w:szCs w:val="24"/>
+          <w:lang w:val="is-IS"/>
+        </w:rPr>
+        <w:t>r</w:t>
+      </w:r>
+      <w:r>
+        <w:rPr>
+          <w:sz w:val="24"/>
+          <w:szCs w:val="24"/>
+          <w:lang w:val="is-IS"/>
+        </w:rPr>
+        <w:t xml:space="preserve"> sem v</w:t>
+      </w:r>
+      <w:r>
+        <w:rPr>
+          <w:sz w:val="24"/>
+          <w:szCs w:val="24"/>
+          <w:lang w:val="is-IS"/>
+        </w:rPr>
+        <w:t>o</w:t>
+      </w:r>
+      <w:r>
+        <w:rPr>
+          <w:sz w:val="24"/>
+          <w:szCs w:val="24"/>
+          <w:lang w:val="is-IS"/>
+        </w:rPr>
+        <w:t>r</w:t>
+      </w:r>
+      <w:r>
+        <w:rPr>
+          <w:sz w:val="24"/>
+          <w:szCs w:val="24"/>
+          <w:lang w:val="is-IS"/>
+        </w:rPr>
+        <w:t>u</w:t>
+      </w:r>
+      <w:r>
+        <w:rPr>
+          <w:sz w:val="24"/>
+          <w:szCs w:val="24"/>
+          <w:lang w:val="is-IS"/>
+        </w:rPr>
+        <w:t xml:space="preserve"> staðsett</w:t>
+      </w:r>
+      <w:r>
+        <w:rPr>
+          <w:sz w:val="24"/>
+          <w:szCs w:val="24"/>
+          <w:lang w:val="is-IS"/>
+        </w:rPr>
+        <w:t>ar</w:t>
+      </w:r>
+      <w:r>
+        <w:rPr>
+          <w:sz w:val="24"/>
+          <w:szCs w:val="24"/>
+          <w:lang w:val="is-IS"/>
+        </w:rPr>
+        <w:t xml:space="preserve"> samkvæmt json skjalinu.</w:t>
+      </w:r>
+    </w:p>
+    <w:p>
+      <w:pPr>
+        <w:rPr>
+          <w:sz w:val="24"/>
+          <w:szCs w:val="24"/>
+          <w:lang w:val="is-IS"/>
+        </w:rPr>
+      </w:pPr>
+      <w:r>
+        <w:rPr>
+          <w:sz w:val="24"/>
+          <w:szCs w:val="24"/>
+          <w:lang w:val="is-IS"/>
+        </w:rPr>
+        <w:t>Vika 11:</w:t>
+      </w:r>
       <w:r>
         <w:rPr>
           <w:sz w:val="24"/>
@@ -1767,174 +2331,414 @@
         </w:rPr>
         <w:t xml:space="preserve"> </w:t>
       </w:r>
-    </w:p>
-    <w:p>
-      <w:pPr>
-        <w:rPr>
-          <w:sz w:val="24"/>
-          <w:szCs w:val="24"/>
-          <w:lang w:val="is-IS"/>
-        </w:rPr>
-      </w:pPr>
-      <w:r>
-        <w:rPr>
-          <w:sz w:val="24"/>
-          <w:szCs w:val="24"/>
-          <w:lang w:val="is-IS"/>
-        </w:rPr>
-        <w:t>Svo tók ég myn</w:t>
-      </w:r>
-      <w:r>
-        <w:rPr>
-          <w:sz w:val="24"/>
-          <w:szCs w:val="24"/>
-          <w:lang w:val="is-IS"/>
-        </w:rPr>
-        <w:t>d</w:t>
-      </w:r>
-      <w:r>
-        <w:rPr>
-          <w:sz w:val="24"/>
-          <w:szCs w:val="24"/>
-          <w:lang w:val="is-IS"/>
-        </w:rPr>
-        <w:t xml:space="preserve">ir af öllum styttunum í garðinum og myndum af nafninu á hverrri styttu. </w:t>
-      </w:r>
-    </w:p>
-    <w:p>
-      <w:pPr>
-        <w:rPr>
-          <w:sz w:val="24"/>
-          <w:szCs w:val="24"/>
-          <w:lang w:val="is-IS"/>
-        </w:rPr>
-      </w:pPr>
-      <w:r>
-        <w:rPr>
-          <w:sz w:val="24"/>
-          <w:szCs w:val="24"/>
-          <w:lang w:val="is-IS"/>
-        </w:rPr>
-        <w:t>Settti þær upplýsingar í json skjal.</w:t>
-      </w:r>
-    </w:p>
-    <w:p>
-      <w:pPr>
-        <w:rPr>
-          <w:sz w:val="24"/>
-          <w:szCs w:val="24"/>
-          <w:lang w:val="is-IS"/>
-        </w:rPr>
-      </w:pPr>
-      <w:r>
-        <w:rPr>
-          <w:sz w:val="24"/>
-          <w:szCs w:val="24"/>
-          <w:lang w:val="is-IS"/>
-        </w:rPr>
-        <w:t>Síðan 3D skannaið ég allar stytturnar í garðinum.</w:t>
-      </w:r>
-    </w:p>
-    <w:p>
-      <w:pPr>
-        <w:rPr>
-          <w:sz w:val="24"/>
-          <w:szCs w:val="24"/>
-          <w:lang w:val="is-IS"/>
-        </w:rPr>
-      </w:pPr>
-      <w:r>
-        <w:rPr>
-          <w:sz w:val="24"/>
-          <w:szCs w:val="24"/>
-          <w:lang w:val="is-IS"/>
-        </w:rPr>
-        <w:t xml:space="preserve">Síðan minnkaði ég gæðin á öllum styttunum(ég minnkaði hnútamagnið með hjálp Blender) til þess að geta notað þær fyrir vefsíðuna. </w:t>
-      </w:r>
-    </w:p>
-    <w:p>
-      <w:pPr>
-        <w:rPr>
-          <w:sz w:val="24"/>
-          <w:szCs w:val="24"/>
-          <w:lang w:val="is-IS"/>
-        </w:rPr>
-      </w:pPr>
-      <w:r>
-        <w:rPr>
-          <w:sz w:val="24"/>
-          <w:szCs w:val="24"/>
-          <w:lang w:val="is-IS"/>
-        </w:rPr>
-        <w:t xml:space="preserve">Síðan setti ég placeholder styttu sem var staðsett samkvæmt json skjalinu. </w:t>
-      </w:r>
-    </w:p>
-    <w:p>
-      <w:pPr>
-        <w:rPr>
-          <w:sz w:val="24"/>
-          <w:szCs w:val="24"/>
-          <w:lang w:val="is-IS"/>
-        </w:rPr>
-      </w:pPr>
-      <w:r>
-        <w:rPr>
-          <w:sz w:val="24"/>
-          <w:szCs w:val="24"/>
-          <w:lang w:val="is-IS"/>
-        </w:rPr>
-        <w:t xml:space="preserve">Ég lærði svo að lazy-loada gögnum. </w:t>
-      </w:r>
-    </w:p>
-    <w:p>
-      <w:pPr>
-        <w:rPr>
-          <w:sz w:val="24"/>
-          <w:szCs w:val="24"/>
-          <w:lang w:val="is-IS"/>
-        </w:rPr>
-      </w:pPr>
-      <w:r>
-        <w:rPr>
-          <w:sz w:val="24"/>
-          <w:szCs w:val="24"/>
-          <w:lang w:val="is-IS"/>
-        </w:rPr>
-        <w:t>Síðan notaði ég Blender til þess að hanna hús Ásmundar.</w:t>
-      </w:r>
-    </w:p>
-    <w:p>
-      <w:pPr>
-        <w:rPr>
-          <w:sz w:val="24"/>
-          <w:szCs w:val="24"/>
-          <w:lang w:val="is-IS"/>
-        </w:rPr>
-      </w:pPr>
-      <w:r>
-        <w:rPr>
-          <w:sz w:val="24"/>
-          <w:szCs w:val="24"/>
-          <w:lang w:val="is-IS"/>
-        </w:rPr>
-        <w:t xml:space="preserve">Síðan bjó ég til pop-up glugga þegar maður smellir á placeholder styttuna. </w:t>
-      </w:r>
-    </w:p>
-    <w:p>
-      <w:pPr>
-        <w:rPr>
-          <w:sz w:val="24"/>
-          <w:szCs w:val="24"/>
-          <w:lang w:val="is-IS"/>
-        </w:rPr>
-      </w:pPr>
-      <w:r>
-        <w:rPr>
-          <w:sz w:val="24"/>
-          <w:szCs w:val="24"/>
-          <w:lang w:val="is-IS"/>
-        </w:rPr>
-        <w:t xml:space="preserve">Síðan bjó ég til shadera til gamans. </w:t>
+      <w:r>
+        <w:rPr>
+          <w:sz w:val="24"/>
+          <w:szCs w:val="24"/>
+          <w:lang w:val="is-IS"/>
+        </w:rPr>
+        <w:t xml:space="preserve">Ég lærði </w:t>
+      </w:r>
+      <w:r>
+        <w:rPr>
+          <w:sz w:val="24"/>
+          <w:szCs w:val="24"/>
+          <w:lang w:val="is-IS"/>
+        </w:rPr>
+        <w:t>að</w:t>
+      </w:r>
+      <w:r>
+        <w:rPr>
+          <w:sz w:val="24"/>
+          <w:szCs w:val="24"/>
+          <w:lang w:val="is-IS"/>
+        </w:rPr>
+        <w:t xml:space="preserve"> lazy-loada gögnum</w:t>
+      </w:r>
+      <w:r>
+        <w:rPr>
+          <w:sz w:val="24"/>
+          <w:szCs w:val="24"/>
+          <w:lang w:val="is-IS"/>
+        </w:rPr>
+        <w:t xml:space="preserve"> sem hjálpaði gífurlega með responsiveness á verkefninu. </w:t>
+      </w:r>
+    </w:p>
+    <w:p>
+      <w:pPr>
+        <w:rPr>
+          <w:sz w:val="24"/>
+          <w:szCs w:val="24"/>
+          <w:lang w:val="is-IS"/>
+        </w:rPr>
+      </w:pPr>
+      <w:r>
+        <w:rPr>
+          <w:noProof/>
+          <w:sz w:val="24"/>
+          <w:szCs w:val="24"/>
+          <w:lang w:val="is-IS"/>
+        </w:rPr>
+        <w:lastRenderedPageBreak/>
+        <w:drawing>
+          <wp:anchor distT="0" distB="0" distL="114300" distR="114300" simplePos="0" relativeHeight="251660288" behindDoc="0" locked="0" layoutInCell="1" allowOverlap="1" wp14:anchorId="345FF12B" wp14:editId="2BD96685">
+            <wp:simplePos x="0" y="0"/>
+            <wp:positionH relativeFrom="column">
+              <wp:posOffset>1153795</wp:posOffset>
+            </wp:positionH>
+            <wp:positionV relativeFrom="paragraph">
+              <wp:posOffset>45720</wp:posOffset>
+            </wp:positionV>
+            <wp:extent cx="3146425" cy="1744980"/>
+            <wp:effectExtent l="0" t="0" r="0" b="7620"/>
+            <wp:wrapThrough wrapText="bothSides">
+              <wp:wrapPolygon edited="0">
+                <wp:start x="0" y="0"/>
+                <wp:lineTo x="0" y="21459"/>
+                <wp:lineTo x="21447" y="21459"/>
+                <wp:lineTo x="21447" y="0"/>
+                <wp:lineTo x="0" y="0"/>
+              </wp:wrapPolygon>
+            </wp:wrapThrough>
+            <wp:docPr id="1743594980" name="Picture 1" descr="A screenshot of a computer code&#10;&#10;AI-generated content may be incorrect."/>
+            <wp:cNvGraphicFramePr>
+              <a:graphicFrameLocks xmlns:a="http://schemas.openxmlformats.org/drawingml/2006/main" noChangeAspect="1"/>
+            </wp:cNvGraphicFramePr>
+            <a:graphic xmlns:a="http://schemas.openxmlformats.org/drawingml/2006/main">
+              <a:graphicData uri="http://schemas.openxmlformats.org/drawingml/2006/picture">
+                <pic:pic xmlns:pic="http://schemas.openxmlformats.org/drawingml/2006/picture">
+                  <pic:nvPicPr>
+                    <pic:cNvPr id="1743594980" name="Picture 1" descr="A screenshot of a computer code&#10;&#10;AI-generated content may be incorrect."/>
+                    <pic:cNvPicPr/>
+                  </pic:nvPicPr>
+                  <pic:blipFill>
+                    <a:blip r:embed="rId20">
+                      <a:extLst>
+                        <a:ext uri="{28A0092B-C50C-407E-A947-70E740481C1C}">
+                          <a14:useLocalDpi xmlns:a14="http://schemas.microsoft.com/office/drawing/2010/main" val="0"/>
+                        </a:ext>
+                      </a:extLst>
+                    </a:blip>
+                    <a:stretch>
+                      <a:fillRect/>
+                    </a:stretch>
+                  </pic:blipFill>
+                  <pic:spPr>
+                    <a:xfrm>
+                      <a:off x="0" y="0"/>
+                      <a:ext cx="3146425" cy="1744980"/>
+                    </a:xfrm>
+                    <a:prstGeom prst="rect">
+                      <a:avLst/>
+                    </a:prstGeom>
+                  </pic:spPr>
+                </pic:pic>
+              </a:graphicData>
+            </a:graphic>
+            <wp14:sizeRelH relativeFrom="margin">
+              <wp14:pctWidth>0</wp14:pctWidth>
+            </wp14:sizeRelH>
+            <wp14:sizeRelV relativeFrom="margin">
+              <wp14:pctHeight>0</wp14:pctHeight>
+            </wp14:sizeRelV>
+          </wp:anchor>
+        </w:drawing>
+      </w:r>
+    </w:p>
+    <w:p>
+      <w:pPr>
+        <w:rPr>
+          <w:sz w:val="24"/>
+          <w:szCs w:val="24"/>
+          <w:lang w:val="is-IS"/>
+        </w:rPr>
+      </w:pPr>
+    </w:p>
+    <w:p>
+      <w:pPr>
+        <w:rPr>
+          <w:sz w:val="24"/>
+          <w:szCs w:val="24"/>
+          <w:lang w:val="is-IS"/>
+        </w:rPr>
+      </w:pPr>
+    </w:p>
+    <w:p>
+      <w:pPr>
+        <w:rPr>
+          <w:sz w:val="24"/>
+          <w:szCs w:val="24"/>
+          <w:lang w:val="is-IS"/>
+        </w:rPr>
+      </w:pPr>
+    </w:p>
+    <w:p>
+      <w:pPr>
+        <w:rPr>
+          <w:sz w:val="24"/>
+          <w:szCs w:val="24"/>
+          <w:lang w:val="is-IS"/>
+        </w:rPr>
+      </w:pPr>
+    </w:p>
+    <w:p>
+      <w:pPr>
+        <w:rPr>
+          <w:sz w:val="24"/>
+          <w:szCs w:val="24"/>
+          <w:lang w:val="is-IS"/>
+        </w:rPr>
+      </w:pPr>
+    </w:p>
+    <w:p>
+      <w:pPr>
+        <w:rPr>
+          <w:sz w:val="24"/>
+          <w:szCs w:val="24"/>
+          <w:lang w:val="is-IS"/>
+        </w:rPr>
+      </w:pPr>
+    </w:p>
+    <w:p>
+      <w:pPr>
+        <w:rPr>
+          <w:sz w:val="24"/>
+          <w:szCs w:val="24"/>
+          <w:lang w:val="is-IS"/>
+        </w:rPr>
+      </w:pPr>
+      <w:r>
+        <w:rPr>
+          <w:sz w:val="24"/>
+          <w:szCs w:val="24"/>
+          <w:lang w:val="is-IS"/>
+        </w:rPr>
+        <w:t xml:space="preserve">Ég byrjaði þá að vinna í að hanna hús Ásmundar í Blender. </w:t>
+      </w:r>
+    </w:p>
+    <w:p>
+      <w:pPr>
+        <w:rPr>
+          <w:sz w:val="24"/>
+          <w:szCs w:val="24"/>
+          <w:lang w:val="is-IS"/>
+        </w:rPr>
+      </w:pPr>
+    </w:p>
+    <w:p>
+      <w:pPr>
+        <w:rPr>
+          <w:sz w:val="24"/>
+          <w:szCs w:val="24"/>
+          <w:lang w:val="is-IS"/>
+        </w:rPr>
+      </w:pPr>
+      <w:r>
+        <w:rPr>
+          <w:sz w:val="24"/>
+          <w:szCs w:val="24"/>
+          <w:lang w:val="is-IS"/>
+        </w:rPr>
+        <w:t>Vika 12:</w:t>
+      </w:r>
+      <w:r>
+        <w:rPr>
+          <w:sz w:val="24"/>
+          <w:szCs w:val="24"/>
+          <w:lang w:val="is-IS"/>
+        </w:rPr>
+        <w:t xml:space="preserve"> Ég bjó</w:t>
+      </w:r>
+      <w:r>
+        <w:rPr>
+          <w:sz w:val="24"/>
+          <w:szCs w:val="24"/>
+          <w:lang w:val="is-IS"/>
+        </w:rPr>
+        <w:t xml:space="preserve"> til pop-up glugga þegar maður smellir á placeholder styttuna.</w:t>
+      </w:r>
+    </w:p>
+    <w:p>
+      <w:pPr>
+        <w:rPr>
+          <w:sz w:val="24"/>
+          <w:szCs w:val="24"/>
+        </w:rPr>
+      </w:pPr>
+      <w:r>
+        <w:rPr>
+          <w:noProof/>
+          <w:sz w:val="24"/>
+          <w:szCs w:val="24"/>
+        </w:rPr>
+        <w:drawing>
+          <wp:inline distT="0" distB="0" distL="0" distR="0" wp14:anchorId="7A66419D" wp14:editId="1D819864">
+            <wp:extent cx="5731510" cy="2753360"/>
+            <wp:effectExtent l="0" t="0" r="2540" b="8890"/>
+            <wp:docPr id="245469965" name="Picture 2" descr="A screenshot of a computer&#10;&#10;AI-generated content may be incorrect."/>
+            <wp:cNvGraphicFramePr>
+              <a:graphicFrameLocks xmlns:a="http://schemas.openxmlformats.org/drawingml/2006/main" noChangeAspect="1"/>
+            </wp:cNvGraphicFramePr>
+            <a:graphic xmlns:a="http://schemas.openxmlformats.org/drawingml/2006/main">
+              <a:graphicData uri="http://schemas.openxmlformats.org/drawingml/2006/picture">
+                <pic:pic xmlns:pic="http://schemas.openxmlformats.org/drawingml/2006/picture">
+                  <pic:nvPicPr>
+                    <pic:cNvPr id="245469965" name="Picture 2" descr="A screenshot of a computer&#10;&#10;AI-generated content may be incorrect."/>
+                    <pic:cNvPicPr>
+                      <a:picLocks noChangeAspect="1" noChangeArrowheads="1"/>
+                    </pic:cNvPicPr>
+                  </pic:nvPicPr>
+                  <pic:blipFill>
+                    <a:blip r:embed="rId21" cstate="print">
+                      <a:extLst>
+                        <a:ext uri="{28A0092B-C50C-407E-A947-70E740481C1C}">
+                          <a14:useLocalDpi xmlns:a14="http://schemas.microsoft.com/office/drawing/2010/main" val="0"/>
+                        </a:ext>
+                      </a:extLst>
+                    </a:blip>
+                    <a:srcRect/>
+                    <a:stretch>
+                      <a:fillRect/>
+                    </a:stretch>
+                  </pic:blipFill>
+                  <pic:spPr bwMode="auto">
+                    <a:xfrm>
+                      <a:off x="0" y="0"/>
+                      <a:ext cx="5731510" cy="2753360"/>
+                    </a:xfrm>
+                    <a:prstGeom prst="rect">
+                      <a:avLst/>
+                    </a:prstGeom>
+                    <a:noFill/>
+                    <a:ln>
+                      <a:noFill/>
+                    </a:ln>
+                  </pic:spPr>
+                </pic:pic>
+              </a:graphicData>
+            </a:graphic>
+          </wp:inline>
+        </w:drawing>
+      </w:r>
+    </w:p>
+    <w:p>
+      <w:pPr>
+        <w:rPr>
+          <w:sz w:val="24"/>
+          <w:szCs w:val="24"/>
+          <w:lang w:val="is-IS"/>
+        </w:rPr>
+      </w:pPr>
+    </w:p>
+    <w:p>
+      <w:pPr>
+        <w:rPr>
+          <w:sz w:val="24"/>
+          <w:szCs w:val="24"/>
+          <w:lang w:val="is-IS"/>
+        </w:rPr>
+      </w:pPr>
+      <w:r>
+        <w:rPr>
+          <w:sz w:val="24"/>
+          <w:szCs w:val="24"/>
+          <w:lang w:val="is-IS"/>
+        </w:rPr>
+        <w:t xml:space="preserve">Ég var enn að vinna í Ásmundarsafni í Blender, og var einnig að vinna í CSS útlitinu á verkefninu.  </w:t>
+      </w:r>
+      <w:r>
+        <w:rPr>
+          <w:sz w:val="24"/>
+          <w:szCs w:val="24"/>
+          <w:lang w:val="is-IS"/>
+        </w:rPr>
+        <w:t>Google Earth var mikið notað þar sem að lögunin á húsinu er frekar krefjandi.</w:t>
+      </w:r>
+    </w:p>
+    <w:p>
+      <w:pPr>
+        <w:rPr>
+          <w:sz w:val="24"/>
+          <w:szCs w:val="24"/>
+          <w:lang w:val="is-IS"/>
+        </w:rPr>
+      </w:pPr>
+      <w:r>
+        <w:rPr>
+          <w:noProof/>
+          <w:sz w:val="24"/>
+          <w:szCs w:val="24"/>
+          <w:lang w:val="is-IS"/>
+        </w:rPr>
+        <w:drawing>
+          <wp:inline distT="0" distB="0" distL="0" distR="0" wp14:anchorId="7B9BC54D" wp14:editId="56306271">
+            <wp:extent cx="2558589" cy="1788750"/>
+            <wp:effectExtent l="0" t="0" r="0" b="2540"/>
+            <wp:docPr id="994651438" name="Picture 1" descr="A white building with a dome roof&#10;&#10;AI-generated content may be incorrect."/>
+            <wp:cNvGraphicFramePr>
+              <a:graphicFrameLocks xmlns:a="http://schemas.openxmlformats.org/drawingml/2006/main" noChangeAspect="1"/>
+            </wp:cNvGraphicFramePr>
+            <a:graphic xmlns:a="http://schemas.openxmlformats.org/drawingml/2006/main">
+              <a:graphicData uri="http://schemas.openxmlformats.org/drawingml/2006/picture">
+                <pic:pic xmlns:pic="http://schemas.openxmlformats.org/drawingml/2006/picture">
+                  <pic:nvPicPr>
+                    <pic:cNvPr id="994651438" name="Picture 1" descr="A white building with a dome roof&#10;&#10;AI-generated content may be incorrect."/>
+                    <pic:cNvPicPr/>
+                  </pic:nvPicPr>
+                  <pic:blipFill>
+                    <a:blip r:embed="rId22"/>
+                    <a:stretch>
+                      <a:fillRect/>
+                    </a:stretch>
+                  </pic:blipFill>
+                  <pic:spPr>
+                    <a:xfrm>
+                      <a:off x="0" y="0"/>
+                      <a:ext cx="2565253" cy="1793409"/>
+                    </a:xfrm>
+                    <a:prstGeom prst="rect">
+                      <a:avLst/>
+                    </a:prstGeom>
+                  </pic:spPr>
+                </pic:pic>
+              </a:graphicData>
+            </a:graphic>
+          </wp:inline>
+        </w:drawing>
+      </w:r>
+    </w:p>
+    <w:p>
+      <w:pPr>
+        <w:rPr>
+          <w:sz w:val="24"/>
+          <w:szCs w:val="24"/>
+          <w:lang w:val="is-IS"/>
+        </w:rPr>
+      </w:pPr>
+    </w:p>
+    <w:p>
+      <w:pPr>
+        <w:rPr>
+          <w:sz w:val="24"/>
+          <w:szCs w:val="24"/>
+          <w:lang w:val="is-IS"/>
+        </w:rPr>
+      </w:pPr>
+      <w:r>
+        <w:rPr>
+          <w:sz w:val="24"/>
+          <w:szCs w:val="24"/>
+          <w:lang w:val="is-IS"/>
+        </w:rPr>
+        <w:t>Vika 13:</w:t>
+      </w:r>
+      <w:r>
+        <w:rPr>
+          <w:sz w:val="24"/>
+          <w:szCs w:val="24"/>
+          <w:lang w:val="is-IS"/>
+        </w:rPr>
+        <w:t xml:space="preserve"> Fíniseraði virknina og CSSið.</w:t>
       </w:r>
     </w:p>
     <w:p>
@@ -2011,7 +2815,6 @@
           <w:szCs w:val="24"/>
           <w:lang w:val="is-IS"/>
         </w:rPr>
-        <w:lastRenderedPageBreak/>
         <w:t xml:space="preserve">Ég bætti við að vinna með Polycam appið á símanum þar sem ég tók myndir frá öllum sjónarhornum styttanna og </w:t>
       </w:r>
       <w:r>
@@ -2071,55 +2874,32 @@
           <w:szCs w:val="24"/>
           <w:lang w:val="is-IS"/>
         </w:rPr>
-        <w:t xml:space="preserve">Það gekk vel að birta gögnin með tilliti til </w:t>
-      </w:r>
-      <w:r>
-        <w:rPr>
-          <w:sz w:val="24"/>
-          <w:szCs w:val="24"/>
-          <w:lang w:val="is-IS"/>
-        </w:rPr>
-        <w:t>staðsetning</w:t>
-      </w:r>
-      <w:r>
-        <w:rPr>
-          <w:sz w:val="24"/>
-          <w:szCs w:val="24"/>
-          <w:lang w:val="is-IS"/>
-        </w:rPr>
-        <w:t>ar</w:t>
-      </w:r>
-      <w:r>
-        <w:rPr>
-          <w:sz w:val="24"/>
-          <w:szCs w:val="24"/>
-          <w:lang w:val="is-IS"/>
-        </w:rPr>
-        <w:t xml:space="preserve"> á</w:t>
-      </w:r>
-      <w:r>
-        <w:rPr>
-          <w:sz w:val="24"/>
-          <w:szCs w:val="24"/>
-          <w:lang w:val="is-IS"/>
-        </w:rPr>
-        <w:t xml:space="preserve"> og </w:t>
-      </w:r>
-      <w:r>
-        <w:rPr>
-          <w:sz w:val="24"/>
-          <w:szCs w:val="24"/>
-          <w:lang w:val="is-IS"/>
-        </w:rPr>
-        <w:t>ég lærð að gera það með raytracer tækni</w:t>
-      </w:r>
-      <w:r>
-        <w:rPr>
-          <w:sz w:val="24"/>
-          <w:szCs w:val="24"/>
-          <w:lang w:val="is-IS"/>
-        </w:rPr>
-        <w:t xml:space="preserve">. Mér fannst forritið mitt vera ágætlega vel skipulagt og </w:t>
+        <w:t xml:space="preserve">Það gekk vel að birta gögnin </w:t>
+      </w:r>
+      <w:r>
+        <w:rPr>
+          <w:sz w:val="24"/>
+          <w:szCs w:val="24"/>
+          <w:lang w:val="is-IS"/>
+        </w:rPr>
+        <w:t>og fá upplýsingar um hverja styttu.</w:t>
+      </w:r>
+    </w:p>
+    <w:p>
+      <w:pPr>
+        <w:rPr>
+          <w:sz w:val="24"/>
+          <w:szCs w:val="24"/>
+          <w:lang w:val="is-IS"/>
+        </w:rPr>
+      </w:pPr>
+      <w:r>
+        <w:rPr>
+          <w:sz w:val="24"/>
+          <w:szCs w:val="24"/>
+          <w:lang w:val="is-IS"/>
+        </w:rPr>
+        <w:t xml:space="preserve">Mér fannst forritið mitt vera ágætlega vel skipulagt og </w:t>
       </w:r>
       <w:r>
         <w:rPr>
@@ -2128,6 +2908,23 @@
           <w:lang w:val="is-IS"/>
         </w:rPr>
         <w:t>bauð það upp á að bæta auðveldlega við virkni, sem ég mun halda áfram með eftir áfangann.</w:t>
+      </w:r>
+    </w:p>
+    <w:p>
+      <w:pPr>
+        <w:rPr>
+          <w:sz w:val="24"/>
+          <w:szCs w:val="24"/>
+          <w:lang w:val="is-IS"/>
+        </w:rPr>
+      </w:pPr>
+      <w:r>
+        <w:rPr>
+          <w:sz w:val="24"/>
+          <w:szCs w:val="24"/>
+          <w:lang w:val="is-IS"/>
+        </w:rPr>
+        <w:t>Það gekk vel að búa til húsið af Ásmundarsafni, þrátt fyrir að það hafi tekið smá æfingu.</w:t>
       </w:r>
     </w:p>
     <w:p>
@@ -2221,6 +3018,23 @@
           <w:lang w:val="is-IS"/>
         </w:rPr>
       </w:pPr>
+      <w:r>
+        <w:rPr>
+          <w:sz w:val="24"/>
+          <w:szCs w:val="24"/>
+          <w:lang w:val="is-IS"/>
+        </w:rPr>
+        <w:t>Það gekk illa að hýsa verkefnið útaf góðu gæðunum frá styttunum og ég mun halda áfram með þetta verkefni og ná að hafa þetta á viðráðanlegum gæðum. Ég þarf bara að finna út hvernig maður gerir það.</w:t>
+      </w:r>
+    </w:p>
+    <w:p>
+      <w:pPr>
+        <w:rPr>
+          <w:sz w:val="24"/>
+          <w:szCs w:val="24"/>
+          <w:lang w:val="is-IS"/>
+        </w:rPr>
+      </w:pPr>
     </w:p>
     <w:p>
       <w:pPr>
@@ -2263,6 +3077,14 @@
         </w:rPr>
         <w:t xml:space="preserve">að læra á lazy loading. Það leyfði mér að hafa fullt af stórum gögnum án þess að hægja á vefsíðunni. </w:t>
       </w:r>
+      <w:r>
+        <w:rPr>
+          <w:sz w:val="24"/>
+          <w:szCs w:val="24"/>
+          <w:lang w:val="is-IS"/>
+        </w:rPr>
+        <w:t>Auk þess lærði ég að nota hljóð í verkefninu sem var afar skemmtileg aukavirkni.</w:t>
+      </w:r>
     </w:p>
     <w:p>
       <w:pPr>
@@ -2281,12 +3103,12 @@
       </w:pPr>
     </w:p>
     <w:sectPr>
-      <w:headerReference w:type="even" r:id="rId17"/>
-      <w:headerReference w:type="default" r:id="rId18"/>
-      <w:footerReference w:type="even" r:id="rId19"/>
-      <w:footerReference w:type="default" r:id="rId20"/>
-      <w:headerReference w:type="first" r:id="rId21"/>
-      <w:footerReference w:type="first" r:id="rId22"/>
+      <w:headerReference w:type="even" r:id="rId23"/>
+      <w:headerReference w:type="default" r:id="rId24"/>
+      <w:footerReference w:type="even" r:id="rId25"/>
+      <w:footerReference w:type="default" r:id="rId26"/>
+      <w:headerReference w:type="first" r:id="rId27"/>
+      <w:footerReference w:type="first" r:id="rId28"/>
       <w:pgSz w:w="11906" w:h="16838"/>
       <w:pgMar w:top="1440" w:right="1440" w:bottom="1440" w:left="1440" w:header="708" w:footer="708" w:gutter="0"/>
       <w:cols w:space="708"/>
@@ -3129,6 +3951,7 @@
   <w:style w:type="character" w:default="1" w:styleId="DefaultParagraphFont">
     <w:name w:val="Default Paragraph Font"/>
     <w:uiPriority w:val="1"/>
+    <w:semiHidden/>
     <w:unhideWhenUsed/>
   </w:style>
   <w:style w:type="table" w:default="1" w:styleId="TableNormal">

</xml_diff>